<commit_message>
docs(nexysa7): add Test Methodology chapter to all four project guides
Insert a new Chapter 3 "Test Methodology" into each guide (cdc/ddr2/rapids/
stream), covering what is under test, what is measured and how (meters, timers,
golden CRC, utilization), the workloads, the oracle, and measurement pitfalls —
per-project. The FPGA block diagram (ch02 Figure 2.1) plus this chapter give each
guide a block-diagram + what's-tested + methodology narrative, matching the depth
stream's DMA_UTILIZATION_MEASUREMENT.md already had.

Renumbered chapters accordingly (Build&Run 3->4, Harness CSR 4->5, Sim Equiv
5->6, Troubleshooting 6->7); updated indexes, in-text cross-references, and the
harness-CSR waveform caption (4.1->5.1). Re-rendered all PDFs/DOCX.

Co-Authored-By: Claude Opus 4.8 (1M context) <noreply@anthropic.com>
Claude-Session: https://claude.ai/code/session_016YzBoFN6cxtg2ZFZ3zKjRc
</commit_message>
<xml_diff>
--- a/projects/NexysA7/ddr2-characterization/docs/DDR2_Characterization_Guide_v0.90.docx
+++ b/projects/NexysA7/ddr2-characterization/docs/DDR2_Characterization_Guide_v0.90.docx
@@ -16,7 +16,7 @@
           <wp:inline distT="0" distB="0" distL="0" distR="0">
             <wp:extent cx="2286000" cy="2286000"/>
             <wp:effectExtent l="0" t="0" r="0" b="0"/>
-            <wp:docPr id="1" name="Picture 48" descr=""/>
+            <wp:docPr id="1" name="Picture 54" descr=""/>
             <wp:cNvGraphicFramePr>
               <a:graphicFrameLocks xmlns:a="http://schemas.openxmlformats.org/drawingml/2006/main" noChangeAspect="1"/>
             </wp:cNvGraphicFramePr>
@@ -24,7 +24,7 @@
               <a:graphicData uri="http://schemas.openxmlformats.org/drawingml/2006/picture">
                 <pic:pic xmlns:pic="http://schemas.openxmlformats.org/drawingml/2006/picture">
                   <pic:nvPicPr>
-                    <pic:cNvPr id="1" name="Picture 48" descr=""/>
+                    <pic:cNvPr id="1" name="Picture 54" descr=""/>
                     <pic:cNvPicPr>
                       <a:picLocks noChangeAspect="1" noChangeArrowheads="1"/>
                     </pic:cNvPicPr>
@@ -160,7 +160,7 @@
             </w:rPr>
             <w:fldChar w:fldCharType="separate"/>
           </w:r>
-          <w:hyperlink w:anchor="__RefHeading___Toc5112_3428382280">
+          <w:hyperlink w:anchor="__RefHeading___Toc5444_4029633280">
             <w:r>
               <w:rPr>
                 <w:webHidden/>
@@ -168,7 +168,7 @@
               </w:rPr>
               <w:t>1 Document Information</w:t>
               <w:tab/>
-              <w:t>7</w:t>
+              <w:t>8</w:t>
             </w:r>
           </w:hyperlink>
         </w:p>
@@ -181,7 +181,7 @@
             </w:tabs>
             <w:rPr/>
           </w:pPr>
-          <w:hyperlink w:anchor="__RefHeading___Toc5114_3428382280">
+          <w:hyperlink w:anchor="__RefHeading___Toc5446_4029633280">
             <w:r>
               <w:rPr>
                 <w:webHidden/>
@@ -189,7 +189,7 @@
               </w:rPr>
               <w:t>1.1 References</w:t>
               <w:tab/>
-              <w:t>7</w:t>
+              <w:t>8</w:t>
             </w:r>
           </w:hyperlink>
         </w:p>
@@ -202,7 +202,7 @@
             </w:tabs>
             <w:rPr/>
           </w:pPr>
-          <w:hyperlink w:anchor="__RefHeading___Toc5116_3428382280">
+          <w:hyperlink w:anchor="__RefHeading___Toc5448_4029633280">
             <w:r>
               <w:rPr>
                 <w:webHidden/>
@@ -210,7 +210,7 @@
               </w:rPr>
               <w:t>1.2 Terminology</w:t>
               <w:tab/>
-              <w:t>8</w:t>
+              <w:t>9</w:t>
             </w:r>
           </w:hyperlink>
         </w:p>
@@ -223,7 +223,7 @@
             </w:tabs>
             <w:rPr/>
           </w:pPr>
-          <w:hyperlink w:anchor="__RefHeading___Toc5118_3428382280">
+          <w:hyperlink w:anchor="__RefHeading___Toc5450_4029633280">
             <w:r>
               <w:rPr>
                 <w:webHidden/>
@@ -231,7 +231,7 @@
               </w:rPr>
               <w:t>1.3 Revision History</w:t>
               <w:tab/>
-              <w:t>8</w:t>
+              <w:t>9</w:t>
             </w:r>
           </w:hyperlink>
         </w:p>
@@ -244,7 +244,7 @@
             </w:tabs>
             <w:rPr/>
           </w:pPr>
-          <w:hyperlink w:anchor="__RefHeading___Toc5120_3428382280">
+          <w:hyperlink w:anchor="__RefHeading___Toc5452_4029633280">
             <w:r>
               <w:rPr>
                 <w:webHidden/>
@@ -252,7 +252,7 @@
               </w:rPr>
               <w:t>2 Overview</w:t>
               <w:tab/>
-              <w:t>8</w:t>
+              <w:t>9</w:t>
             </w:r>
           </w:hyperlink>
         </w:p>
@@ -265,7 +265,7 @@
             </w:tabs>
             <w:rPr/>
           </w:pPr>
-          <w:hyperlink w:anchor="__RefHeading___Toc5122_3428382280">
+          <w:hyperlink w:anchor="__RefHeading___Toc5454_4029633280">
             <w:r>
               <w:rPr>
                 <w:webHidden/>
@@ -273,7 +273,7 @@
               </w:rPr>
               <w:t>2.1 What it characterizes</w:t>
               <w:tab/>
-              <w:t>8</w:t>
+              <w:t>9</w:t>
             </w:r>
           </w:hyperlink>
         </w:p>
@@ -286,7 +286,7 @@
             </w:tabs>
             <w:rPr/>
           </w:pPr>
-          <w:hyperlink w:anchor="__RefHeading___Toc5124_3428382280">
+          <w:hyperlink w:anchor="__RefHeading___Toc5456_4029633280">
             <w:r>
               <w:rPr>
                 <w:webHidden/>
@@ -294,7 +294,7 @@
               </w:rPr>
               <w:t>2.2 The three flows</w:t>
               <w:tab/>
-              <w:t>9</w:t>
+              <w:t>10</w:t>
             </w:r>
           </w:hyperlink>
         </w:p>
@@ -307,7 +307,7 @@
             </w:tabs>
             <w:rPr/>
           </w:pPr>
-          <w:hyperlink w:anchor="__RefHeading___Toc5126_3428382280">
+          <w:hyperlink w:anchor="__RefHeading___Toc5458_4029633280">
             <w:r>
               <w:rPr>
                 <w:webHidden/>
@@ -315,7 +315,7 @@
               </w:rPr>
               <w:t>2.3 Board and tools</w:t>
               <w:tab/>
-              <w:t>9</w:t>
+              <w:t>10</w:t>
             </w:r>
           </w:hyperlink>
         </w:p>
@@ -328,7 +328,7 @@
             </w:tabs>
             <w:rPr/>
           </w:pPr>
-          <w:hyperlink w:anchor="__RefHeading___Toc5128_3428382280">
+          <w:hyperlink w:anchor="__RefHeading___Toc5460_4029633280">
             <w:r>
               <w:rPr>
                 <w:webHidden/>
@@ -336,7 +336,7 @@
               </w:rPr>
               <w:t>2.4 Workload families</w:t>
               <w:tab/>
-              <w:t>10</w:t>
+              <w:t>11</w:t>
             </w:r>
           </w:hyperlink>
         </w:p>
@@ -349,7 +349,7 @@
             </w:tabs>
             <w:rPr/>
           </w:pPr>
-          <w:hyperlink w:anchor="__RefHeading___Toc5130_3428382280">
+          <w:hyperlink w:anchor="__RefHeading___Toc5462_4029633280">
             <w:r>
               <w:rPr>
                 <w:webHidden/>
@@ -357,7 +357,7 @@
               </w:rPr>
               <w:t>3 How It Works</w:t>
               <w:tab/>
-              <w:t>10</w:t>
+              <w:t>11</w:t>
             </w:r>
           </w:hyperlink>
         </w:p>
@@ -370,7 +370,7 @@
             </w:tabs>
             <w:rPr/>
           </w:pPr>
-          <w:hyperlink w:anchor="__RefHeading___Toc5132_3428382280">
+          <w:hyperlink w:anchor="__RefHeading___Toc5464_4029633280">
             <w:r>
               <w:rPr>
                 <w:webHidden/>
@@ -378,7 +378,7 @@
               </w:rPr>
               <w:t>3.1 The transport spine</w:t>
               <w:tab/>
-              <w:t>10</w:t>
+              <w:t>11</w:t>
             </w:r>
           </w:hyperlink>
         </w:p>
@@ -391,7 +391,7 @@
             </w:tabs>
             <w:rPr/>
           </w:pPr>
-          <w:hyperlink w:anchor="__RefHeading___Toc5134_3428382280">
+          <w:hyperlink w:anchor="__RefHeading___Toc5466_4029633280">
             <w:r>
               <w:rPr>
                 <w:webHidden/>
@@ -399,7 +399,7 @@
               </w:rPr>
               <w:t>3.1.1 Figure 2.1: DDR2 Characterization Harness Spine</w:t>
               <w:tab/>
-              <w:t>11</w:t>
+              <w:t>12</w:t>
             </w:r>
           </w:hyperlink>
         </w:p>
@@ -412,7 +412,7 @@
             </w:tabs>
             <w:rPr/>
           </w:pPr>
-          <w:hyperlink w:anchor="__RefHeading___Toc5136_3428382280">
+          <w:hyperlink w:anchor="__RefHeading___Toc5468_4029633280">
             <w:r>
               <w:rPr>
                 <w:webHidden/>
@@ -420,7 +420,7 @@
               </w:rPr>
               <w:t>3.2 The 1→4 AXIL bridge</w:t>
               <w:tab/>
-              <w:t>11</w:t>
+              <w:t>12</w:t>
             </w:r>
           </w:hyperlink>
         </w:p>
@@ -433,7 +433,7 @@
             </w:tabs>
             <w:rPr/>
           </w:pPr>
-          <w:hyperlink w:anchor="__RefHeading___Toc5138_3428382280">
+          <w:hyperlink w:anchor="__RefHeading___Toc5470_4029633280">
             <w:r>
               <w:rPr>
                 <w:webHidden/>
@@ -441,7 +441,7 @@
               </w:rPr>
               <w:t>3.3 Key RTL blocks</w:t>
               <w:tab/>
-              <w:t>11</w:t>
+              <w:t>12</w:t>
             </w:r>
           </w:hyperlink>
         </w:p>
@@ -454,7 +454,7 @@
             </w:tabs>
             <w:rPr/>
           </w:pPr>
-          <w:hyperlink w:anchor="__RefHeading___Toc5140_3428382280">
+          <w:hyperlink w:anchor="__RefHeading___Toc5472_4029633280">
             <w:r>
               <w:rPr>
                 <w:webHidden/>
@@ -462,7 +462,7 @@
               </w:rPr>
               <w:t>3.4 The characterization engines</w:t>
               <w:tab/>
-              <w:t>12</w:t>
+              <w:t>13</w:t>
             </w:r>
           </w:hyperlink>
         </w:p>
@@ -475,7 +475,7 @@
             </w:tabs>
             <w:rPr/>
           </w:pPr>
-          <w:hyperlink w:anchor="__RefHeading___Toc5142_3428382280">
+          <w:hyperlink w:anchor="__RefHeading___Toc5474_4029633280">
             <w:r>
               <w:rPr>
                 <w:webHidden/>
@@ -483,7 +483,7 @@
               </w:rPr>
               <w:t>3.5 The controller, DFI, and PHY (black boxes)</w:t>
               <w:tab/>
-              <w:t>12</w:t>
+              <w:t>13</w:t>
             </w:r>
           </w:hyperlink>
         </w:p>
@@ -496,15 +496,15 @@
             </w:tabs>
             <w:rPr/>
           </w:pPr>
-          <w:hyperlink w:anchor="__RefHeading___Toc5144_3428382280">
+          <w:hyperlink w:anchor="__RefHeading___Toc5476_4029633280">
             <w:r>
               <w:rPr>
                 <w:webHidden/>
                 <w:rStyle w:val="IndexLink"/>
               </w:rPr>
-              <w:t>4 Build and Run</w:t>
+              <w:t>4 Test Methodology</w:t>
               <w:tab/>
-              <w:t>13</w:t>
+              <w:t>14</w:t>
             </w:r>
           </w:hyperlink>
         </w:p>
@@ -517,15 +517,15 @@
             </w:tabs>
             <w:rPr/>
           </w:pPr>
-          <w:hyperlink w:anchor="__RefHeading___Toc5146_3428382280">
+          <w:hyperlink w:anchor="__RefHeading___Toc5478_4029633280">
             <w:r>
               <w:rPr>
                 <w:webHidden/>
                 <w:rStyle w:val="IndexLink"/>
               </w:rPr>
-              <w:t>4.1 flows-ours-uart make targets</w:t>
+              <w:t>4.1 What is under test</w:t>
               <w:tab/>
-              <w:t>13</w:t>
+              <w:t>14</w:t>
             </w:r>
           </w:hyperlink>
         </w:p>
@@ -538,13 +538,13 @@
             </w:tabs>
             <w:rPr/>
           </w:pPr>
-          <w:hyperlink w:anchor="__RefHeading___Toc5148_3428382280">
+          <w:hyperlink w:anchor="__RefHeading___Toc5480_4029633280">
             <w:r>
               <w:rPr>
                 <w:webHidden/>
                 <w:rStyle w:val="IndexLink"/>
               </w:rPr>
-              <w:t>4.2 The host programs (flows-ours-uart/host/)</w:t>
+              <w:t>4.2 What is measured, and how</w:t>
               <w:tab/>
               <w:t>14</w:t>
             </w:r>
@@ -559,13 +559,55 @@
             </w:tabs>
             <w:rPr/>
           </w:pPr>
-          <w:hyperlink w:anchor="__RefHeading___Toc5150_3428382280">
+          <w:hyperlink w:anchor="__RefHeading___Toc5482_4029633280">
             <w:r>
               <w:rPr>
                 <w:webHidden/>
                 <w:rStyle w:val="IndexLink"/>
               </w:rPr>
-              <w:t>4.3 Typical bring-up sequence</w:t>
+              <w:t>4.3 Workloads</w:t>
+              <w:tab/>
+              <w:t>14</w:t>
+            </w:r>
+          </w:hyperlink>
+        </w:p>
+        <w:p>
+          <w:pPr>
+            <w:pStyle w:val="TOC2"/>
+            <w:tabs>
+              <w:tab w:val="clear" w:pos="9077"/>
+              <w:tab w:val="right" w:pos="9359" w:leader="dot"/>
+            </w:tabs>
+            <w:rPr/>
+          </w:pPr>
+          <w:hyperlink w:anchor="__RefHeading___Toc5484_4029633280">
+            <w:r>
+              <w:rPr>
+                <w:webHidden/>
+                <w:rStyle w:val="IndexLink"/>
+              </w:rPr>
+              <w:t>4.4 The oracle</w:t>
+              <w:tab/>
+              <w:t>15</w:t>
+            </w:r>
+          </w:hyperlink>
+        </w:p>
+        <w:p>
+          <w:pPr>
+            <w:pStyle w:val="TOC2"/>
+            <w:tabs>
+              <w:tab w:val="clear" w:pos="9077"/>
+              <w:tab w:val="right" w:pos="9359" w:leader="dot"/>
+            </w:tabs>
+            <w:rPr/>
+          </w:pPr>
+          <w:hyperlink w:anchor="__RefHeading___Toc5486_4029633280">
+            <w:r>
+              <w:rPr>
+                <w:webHidden/>
+                <w:rStyle w:val="IndexLink"/>
+              </w:rPr>
+              <w:t>4.5 Measurement pitfalls</w:t>
               <w:tab/>
               <w:t>15</w:t>
             </w:r>
@@ -580,13 +622,13 @@
             </w:tabs>
             <w:rPr/>
           </w:pPr>
-          <w:hyperlink w:anchor="__RefHeading___Toc5152_3428382280">
+          <w:hyperlink w:anchor="__RefHeading___Toc5488_4029633280">
             <w:r>
               <w:rPr>
                 <w:webHidden/>
                 <w:rStyle w:val="IndexLink"/>
               </w:rPr>
-              <w:t>5 Harness CSR Configuration</w:t>
+              <w:t>5 Build and Run</w:t>
               <w:tab/>
               <w:t>15</w:t>
             </w:r>
@@ -601,13 +643,13 @@
             </w:tabs>
             <w:rPr/>
           </w:pPr>
-          <w:hyperlink w:anchor="__RefHeading___Toc5154_3428382280">
+          <w:hyperlink w:anchor="__RefHeading___Toc5490_4029633280">
             <w:r>
               <w:rPr>
                 <w:webHidden/>
                 <w:rStyle w:val="IndexLink"/>
               </w:rPr>
-              <w:t>5.1 Bridge address map</w:t>
+              <w:t>5.1 flows-ours-uart make targets</w:t>
               <w:tab/>
               <w:t>15</w:t>
             </w:r>
@@ -622,15 +664,99 @@
             </w:tabs>
             <w:rPr/>
           </w:pPr>
-          <w:hyperlink w:anchor="__RefHeading___Toc5156_3428382280">
+          <w:hyperlink w:anchor="__RefHeading___Toc5492_4029633280">
             <w:r>
               <w:rPr>
                 <w:webHidden/>
                 <w:rStyle w:val="IndexLink"/>
               </w:rPr>
-              <w:t>5.2 By-name access (RDL → regmap)</w:t>
+              <w:t>5.2 The host programs (flows-ours-uart/host/)</w:t>
               <w:tab/>
-              <w:t>15</w:t>
+              <w:t>16</w:t>
+            </w:r>
+          </w:hyperlink>
+        </w:p>
+        <w:p>
+          <w:pPr>
+            <w:pStyle w:val="TOC2"/>
+            <w:tabs>
+              <w:tab w:val="clear" w:pos="9077"/>
+              <w:tab w:val="right" w:pos="9359" w:leader="dot"/>
+            </w:tabs>
+            <w:rPr/>
+          </w:pPr>
+          <w:hyperlink w:anchor="__RefHeading___Toc5494_4029633280">
+            <w:r>
+              <w:rPr>
+                <w:webHidden/>
+                <w:rStyle w:val="IndexLink"/>
+              </w:rPr>
+              <w:t>5.3 Typical bring-up sequence</w:t>
+              <w:tab/>
+              <w:t>17</w:t>
+            </w:r>
+          </w:hyperlink>
+        </w:p>
+        <w:p>
+          <w:pPr>
+            <w:pStyle w:val="TOC1"/>
+            <w:tabs>
+              <w:tab w:val="clear" w:pos="9360"/>
+              <w:tab w:val="right" w:pos="9359" w:leader="dot"/>
+            </w:tabs>
+            <w:rPr/>
+          </w:pPr>
+          <w:hyperlink w:anchor="__RefHeading___Toc5496_4029633280">
+            <w:r>
+              <w:rPr>
+                <w:webHidden/>
+                <w:rStyle w:val="IndexLink"/>
+              </w:rPr>
+              <w:t>6 Harness CSR Configuration</w:t>
+              <w:tab/>
+              <w:t>17</w:t>
+            </w:r>
+          </w:hyperlink>
+        </w:p>
+        <w:p>
+          <w:pPr>
+            <w:pStyle w:val="TOC2"/>
+            <w:tabs>
+              <w:tab w:val="clear" w:pos="9077"/>
+              <w:tab w:val="right" w:pos="9359" w:leader="dot"/>
+            </w:tabs>
+            <w:rPr/>
+          </w:pPr>
+          <w:hyperlink w:anchor="__RefHeading___Toc5498_4029633280">
+            <w:r>
+              <w:rPr>
+                <w:webHidden/>
+                <w:rStyle w:val="IndexLink"/>
+              </w:rPr>
+              <w:t>6.1 Bridge address map</w:t>
+              <w:tab/>
+              <w:t>17</w:t>
+            </w:r>
+          </w:hyperlink>
+        </w:p>
+        <w:p>
+          <w:pPr>
+            <w:pStyle w:val="TOC2"/>
+            <w:tabs>
+              <w:tab w:val="clear" w:pos="9077"/>
+              <w:tab w:val="right" w:pos="9359" w:leader="dot"/>
+            </w:tabs>
+            <w:rPr/>
+          </w:pPr>
+          <w:hyperlink w:anchor="__RefHeading___Toc5500_4029633280">
+            <w:r>
+              <w:rPr>
+                <w:webHidden/>
+                <w:rStyle w:val="IndexLink"/>
+              </w:rPr>
+              <w:t>6.2 By-name access (RDL → regmap)</w:t>
+              <w:tab/>
+              <w:t>18</w:t>
             </w:r>
           </w:hyperlink>
         </w:p>
@@ -643,15 +769,15 @@
             </w:tabs>
             <w:rPr/>
           </w:pPr>
-          <w:hyperlink w:anchor="__RefHeading___Toc5158_3428382280">
+          <w:hyperlink w:anchor="__RefHeading___Toc5502_4029633280">
             <w:r>
               <w:rPr>
                 <w:webHidden/>
                 <w:rStyle w:val="IndexLink"/>
               </w:rPr>
-              <w:t>5.2.1 Waveform 4.1: Engine Kick and Poll</w:t>
+              <w:t>6.2.1 Waveform 5.1: Engine Kick and Poll</w:t>
               <w:tab/>
-              <w:t>16</w:t>
+              <w:t>19</w:t>
             </w:r>
           </w:hyperlink>
         </w:p>
@@ -664,15 +790,15 @@
             </w:tabs>
             <w:rPr/>
           </w:pPr>
-          <w:hyperlink w:anchor="__RefHeading___Toc5160_3428382280">
+          <w:hyperlink w:anchor="__RefHeading___Toc5504_4029633280">
             <w:r>
               <w:rPr>
                 <w:webHidden/>
                 <w:rStyle w:val="IndexLink"/>
               </w:rPr>
-              <w:t>5.3 Control / status (offsets relative to HARNESS_CSR_BASE)</w:t>
+              <w:t>6.3 Control / status (offsets relative to HARNESS_CSR_BASE)</w:t>
               <w:tab/>
-              <w:t>16</w:t>
+              <w:t>19</w:t>
             </w:r>
           </w:hyperlink>
         </w:p>
@@ -685,15 +811,15 @@
             </w:tabs>
             <w:rPr/>
           </w:pPr>
-          <w:hyperlink w:anchor="__RefHeading___Toc5162_3428382280">
+          <w:hyperlink w:anchor="__RefHeading___Toc5506_4029633280">
             <w:r>
               <w:rPr>
                 <w:webHidden/>
                 <w:rStyle w:val="IndexLink"/>
               </w:rPr>
-              <w:t>5.4 Timer</w:t>
+              <w:t>6.4 Timer</w:t>
               <w:tab/>
-              <w:t>18</w:t>
+              <w:t>20</w:t>
             </w:r>
           </w:hyperlink>
         </w:p>
@@ -706,15 +832,15 @@
             </w:tabs>
             <w:rPr/>
           </w:pPr>
-          <w:hyperlink w:anchor="__RefHeading___Toc5164_3428382280">
+          <w:hyperlink w:anchor="__RefHeading___Toc5508_4029633280">
             <w:r>
               <w:rPr>
                 <w:webHidden/>
                 <w:rStyle w:val="IndexLink"/>
               </w:rPr>
-              <w:t>5.5 Runtime controller cfg + DFI tuning</w:t>
+              <w:t>6.5 Runtime controller cfg + DFI tuning</w:t>
               <w:tab/>
-              <w:t>18</w:t>
+              <w:t>21</w:t>
             </w:r>
           </w:hyperlink>
         </w:p>
@@ -727,15 +853,15 @@
             </w:tabs>
             <w:rPr/>
           </w:pPr>
-          <w:hyperlink w:anchor="__RefHeading___Toc5166_3428382280">
+          <w:hyperlink w:anchor="__RefHeading___Toc5510_4029633280">
             <w:r>
               <w:rPr>
                 <w:webHidden/>
                 <w:rStyle w:val="IndexLink"/>
               </w:rPr>
-              <w:t>5.6 a7ddrphy calibration passthrough (hardware only)</w:t>
+              <w:t>6.6 a7ddrphy calibration passthrough (hardware only)</w:t>
               <w:tab/>
-              <w:t>19</w:t>
+              <w:t>22</w:t>
             </w:r>
           </w:hyperlink>
         </w:p>
@@ -748,15 +874,15 @@
             </w:tabs>
             <w:rPr/>
           </w:pPr>
-          <w:hyperlink w:anchor="__RefHeading___Toc5168_3428382280">
+          <w:hyperlink w:anchor="__RefHeading___Toc5512_4029633280">
             <w:r>
               <w:rPr>
                 <w:webHidden/>
                 <w:rStyle w:val="IndexLink"/>
               </w:rPr>
-              <w:t>5.7 Engine config (WR 0x100–0x128, RD 0x180–0x1A8)</w:t>
+              <w:t>6.7 Engine config (WR 0x100–0x128, RD 0x180–0x1A8)</w:t>
               <w:tab/>
-              <w:t>19</w:t>
+              <w:t>22</w:t>
             </w:r>
           </w:hyperlink>
         </w:p>
@@ -769,15 +895,15 @@
             </w:tabs>
             <w:rPr/>
           </w:pPr>
-          <w:hyperlink w:anchor="__RefHeading___Toc5170_3428382280">
+          <w:hyperlink w:anchor="__RefHeading___Toc5514_4029633280">
             <w:r>
               <w:rPr>
                 <w:webHidden/>
                 <w:rStyle w:val="IndexLink"/>
               </w:rPr>
-              <w:t>5.8 Perf observability (0x1C0–0x1E8)</w:t>
+              <w:t>6.8 Perf observability (0x1C0–0x1E8)</w:t>
               <w:tab/>
-              <w:t>20</w:t>
+              <w:t>23</w:t>
             </w:r>
           </w:hyperlink>
         </w:p>
@@ -790,15 +916,15 @@
             </w:tabs>
             <w:rPr/>
           </w:pPr>
-          <w:hyperlink w:anchor="__RefHeading___Toc5172_3428382280">
+          <w:hyperlink w:anchor="__RefHeading___Toc5516_4029633280">
             <w:r>
               <w:rPr>
                 <w:webHidden/>
                 <w:rStyle w:val="IndexLink"/>
               </w:rPr>
-              <w:t>6 Simulation / Silicon Equivalence</w:t>
+              <w:t>7 Simulation / Silicon Equivalence</w:t>
               <w:tab/>
-              <w:t>21</w:t>
+              <w:t>23</w:t>
             </w:r>
           </w:hyperlink>
         </w:p>
@@ -811,15 +937,15 @@
             </w:tabs>
             <w:rPr/>
           </w:pPr>
-          <w:hyperlink w:anchor="__RefHeading___Toc5174_3428382280">
+          <w:hyperlink w:anchor="__RefHeading___Toc5518_4029633280">
             <w:r>
               <w:rPr>
                 <w:webHidden/>
                 <w:rStyle w:val="IndexLink"/>
               </w:rPr>
-              <w:t>6.1 Testbenches</w:t>
+              <w:t>7.1 Testbenches</w:t>
               <w:tab/>
-              <w:t>21</w:t>
+              <w:t>24</w:t>
             </w:r>
           </w:hyperlink>
         </w:p>
@@ -832,15 +958,15 @@
             </w:tabs>
             <w:rPr/>
           </w:pPr>
-          <w:hyperlink w:anchor="__RefHeading___Toc5176_3428382280">
+          <w:hyperlink w:anchor="__RefHeading___Toc5520_4029633280">
             <w:r>
               <w:rPr>
                 <w:webHidden/>
                 <w:rStyle w:val="IndexLink"/>
               </w:rPr>
-              <w:t>6.2 How the same program runs in sim</w:t>
+              <w:t>7.2 How the same program runs in sim</w:t>
               <w:tab/>
-              <w:t>21</w:t>
+              <w:t>24</w:t>
             </w:r>
           </w:hyperlink>
         </w:p>
@@ -853,15 +979,15 @@
             </w:tabs>
             <w:rPr/>
           </w:pPr>
-          <w:hyperlink w:anchor="__RefHeading___Toc5178_3428382280">
+          <w:hyperlink w:anchor="__RefHeading___Toc5522_4029633280">
             <w:r>
               <w:rPr>
                 <w:webHidden/>
                 <w:rStyle w:val="IndexLink"/>
               </w:rPr>
-              <w:t>6.3 Match the board’s exact DFI config</w:t>
+              <w:t>7.3 Match the board’s exact DFI config</w:t>
               <w:tab/>
-              <w:t>22</w:t>
+              <w:t>24</w:t>
             </w:r>
           </w:hyperlink>
         </w:p>
@@ -874,15 +1000,15 @@
             </w:tabs>
             <w:rPr/>
           </w:pPr>
-          <w:hyperlink w:anchor="__RefHeading___Toc5180_3428382280">
+          <w:hyperlink w:anchor="__RefHeading___Toc5524_4029633280">
             <w:r>
               <w:rPr>
                 <w:webHidden/>
                 <w:rStyle w:val="IndexLink"/>
               </w:rPr>
-              <w:t>6.4 What the sim can and cannot reproduce</w:t>
+              <w:t>7.4 What the sim can and cannot reproduce</w:t>
               <w:tab/>
-              <w:t>22</w:t>
+              <w:t>25</w:t>
             </w:r>
           </w:hyperlink>
         </w:p>
@@ -895,15 +1021,15 @@
             </w:tabs>
             <w:rPr/>
           </w:pPr>
-          <w:hyperlink w:anchor="__RefHeading___Toc5182_3428382280">
+          <w:hyperlink w:anchor="__RefHeading___Toc5526_4029633280">
             <w:r>
               <w:rPr>
                 <w:webHidden/>
                 <w:rStyle w:val="IndexLink"/>
               </w:rPr>
-              <w:t>7 Troubleshooting</w:t>
+              <w:t>8 Troubleshooting</w:t>
               <w:tab/>
-              <w:t>22</w:t>
+              <w:t>25</w:t>
             </w:r>
           </w:hyperlink>
         </w:p>
@@ -916,15 +1042,15 @@
             </w:tabs>
             <w:rPr/>
           </w:pPr>
-          <w:hyperlink w:anchor="__RefHeading___Toc5184_3428382280">
+          <w:hyperlink w:anchor="__RefHeading___Toc5528_4029633280">
             <w:r>
               <w:rPr>
                 <w:webHidden/>
                 <w:rStyle w:val="IndexLink"/>
               </w:rPr>
-              <w:t>7.1 Current board state</w:t>
+              <w:t>8.1 Current board state</w:t>
               <w:tab/>
-              <w:t>22</w:t>
+              <w:t>25</w:t>
             </w:r>
           </w:hyperlink>
         </w:p>
@@ -937,15 +1063,15 @@
             </w:tabs>
             <w:rPr/>
           </w:pPr>
-          <w:hyperlink w:anchor="__RefHeading___Toc5186_3428382280">
+          <w:hyperlink w:anchor="__RefHeading___Toc5530_4029633280">
             <w:r>
               <w:rPr>
                 <w:webHidden/>
                 <w:rStyle w:val="IndexLink"/>
               </w:rPr>
-              <w:t>7.2 Sticky errors look like a wedge</w:t>
+              <w:t>8.2 Sticky errors look like a wedge</w:t>
               <w:tab/>
-              <w:t>22</w:t>
+              <w:t>25</w:t>
             </w:r>
           </w:hyperlink>
         </w:p>
@@ -958,15 +1084,15 @@
             </w:tabs>
             <w:rPr/>
           </w:pPr>
-          <w:hyperlink w:anchor="__RefHeading___Toc5188_3428382280">
+          <w:hyperlink w:anchor="__RefHeading___Toc5532_4029633280">
             <w:r>
               <w:rPr>
                 <w:webHidden/>
                 <w:rStyle w:val="IndexLink"/>
               </w:rPr>
-              <w:t>7.3 Known bugs / bounds</w:t>
+              <w:t>8.3 Known bugs / bounds</w:t>
               <w:tab/>
-              <w:t>23</w:t>
+              <w:t>25</w:t>
             </w:r>
           </w:hyperlink>
         </w:p>
@@ -979,15 +1105,15 @@
             </w:tabs>
             <w:rPr/>
           </w:pPr>
-          <w:hyperlink w:anchor="__RefHeading___Toc5190_3428382280">
+          <w:hyperlink w:anchor="__RefHeading___Toc5534_4029633280">
             <w:r>
               <w:rPr>
                 <w:webHidden/>
                 <w:rStyle w:val="IndexLink"/>
               </w:rPr>
-              <w:t>7.4 Cannot find the board</w:t>
+              <w:t>8.4 Cannot find the board</w:t>
               <w:tab/>
-              <w:t>23</w:t>
+              <w:t>26</w:t>
             </w:r>
           </w:hyperlink>
         </w:p>
@@ -1000,15 +1126,15 @@
             </w:tabs>
             <w:rPr/>
           </w:pPr>
-          <w:hyperlink w:anchor="__RefHeading___Toc5192_3428382280">
+          <w:hyperlink w:anchor="__RefHeading___Toc5536_4029633280">
             <w:r>
               <w:rPr>
                 <w:webHidden/>
                 <w:rStyle w:val="IndexLink"/>
               </w:rPr>
-              <w:t>7.5 a7ddrphy is not simulatable</w:t>
+              <w:t>8.5 a7ddrphy is not simulatable</w:t>
               <w:tab/>
-              <w:t>23</w:t>
+              <w:t>26</w:t>
             </w:r>
           </w:hyperlink>
         </w:p>
@@ -1021,15 +1147,15 @@
             </w:tabs>
             <w:rPr/>
           </w:pPr>
-          <w:hyperlink w:anchor="__RefHeading___Toc5194_3428382280">
+          <w:hyperlink w:anchor="__RefHeading___Toc5538_4029633280">
             <w:r>
               <w:rPr>
                 <w:webHidden/>
                 <w:rStyle w:val="IndexLink"/>
               </w:rPr>
-              <w:t>7.6 debug_sram trace ring is disabled on this build</w:t>
+              <w:t>8.6 debug_sram trace ring is disabled on this build</w:t>
               <w:tab/>
-              <w:t>24</w:t>
+              <w:t>26</w:t>
             </w:r>
           </w:hyperlink>
         </w:p>
@@ -1042,15 +1168,15 @@
             </w:tabs>
             <w:rPr/>
           </w:pPr>
-          <w:hyperlink w:anchor="__RefHeading___Toc5196_3428382280">
+          <w:hyperlink w:anchor="__RefHeading___Toc5540_4029633280">
             <w:r>
               <w:rPr>
                 <w:webHidden/>
                 <w:rStyle w:val="IndexLink"/>
               </w:rPr>
-              <w:t>7.7 LiteDRAM baseline flow</w:t>
+              <w:t>8.7 LiteDRAM baseline flow</w:t>
               <w:tab/>
-              <w:t>24</w:t>
+              <w:t>26</w:t>
             </w:r>
           </w:hyperlink>
           <w:r>
@@ -1137,7 +1263,7 @@
           <w:rPr>
             <w:rStyle w:val="ListLabel1"/>
           </w:rPr>
-          <w:t>11</w:t>
+          <w:t>12</w:t>
         </w:r>
         <w:r>
           <w:rPr>
@@ -1222,7 +1348,7 @@
           <w:rPr>
             <w:rStyle w:val="ListLabel1"/>
           </w:rPr>
-          <w:t>7</w:t>
+          <w:t>8</w:t>
         </w:r>
         <w:r>
           <w:rPr>
@@ -1279,7 +1405,7 @@
           <w:rPr>
             <w:rStyle w:val="ListLabel1"/>
           </w:rPr>
-          <w:t>8</w:t>
+          <w:t>9</w:t>
         </w:r>
         <w:r>
           <w:rPr>
@@ -1336,7 +1462,7 @@
           <w:rPr>
             <w:rStyle w:val="ListLabel1"/>
           </w:rPr>
-          <w:t>9</w:t>
+          <w:t>10</w:t>
         </w:r>
         <w:r>
           <w:rPr>
@@ -1393,7 +1519,7 @@
           <w:rPr>
             <w:rStyle w:val="ListLabel1"/>
           </w:rPr>
-          <w:t>9</w:t>
+          <w:t>10</w:t>
         </w:r>
         <w:r>
           <w:rPr>
@@ -1450,7 +1576,7 @@
           <w:rPr>
             <w:rStyle w:val="ListLabel1"/>
           </w:rPr>
-          <w:t>10</w:t>
+          <w:t>11</w:t>
         </w:r>
         <w:r>
           <w:rPr>
@@ -1507,7 +1633,7 @@
           <w:rPr>
             <w:rStyle w:val="ListLabel1"/>
           </w:rPr>
-          <w:t>11</w:t>
+          <w:t>12</w:t>
         </w:r>
         <w:r>
           <w:rPr>
@@ -1527,14 +1653,14 @@
         <w:spacing w:before="0" w:after="0"/>
         <w:rPr/>
       </w:pPr>
-      <w:hyperlink w:anchor="_Tab_7_flows_ours_uart_make">
+      <w:hyperlink w:anchor="_Tab_7_What_is_measured">
         <w:r>
           <w:rPr>
             <w:rStyle w:val="ListLabel1"/>
             <w:color w:val="000000"/>
             <w:sz w:val="24"/>
           </w:rPr>
-          <w:t>Table 7: flows-ours-uart make targets</w:t>
+          <w:t>Table 7: What is measured</w:t>
         </w:r>
         <w:r>
           <w:rPr>
@@ -1552,7 +1678,7 @@
           <w:rPr>
             <w:rStyle w:val="ListLabel1"/>
           </w:rPr>
-          <w:instrText xml:space="preserve"> PAGEREF _Tab_7_flows_ours_uart_make \h </w:instrText>
+          <w:instrText xml:space="preserve"> PAGEREF _Tab_7_What_is_measured \h </w:instrText>
         </w:r>
         <w:r>
           <w:rPr>
@@ -1564,7 +1690,7 @@
           <w:rPr>
             <w:rStyle w:val="ListLabel1"/>
           </w:rPr>
-          <w:t>13</w:t>
+          <w:t>14</w:t>
         </w:r>
         <w:r>
           <w:rPr>
@@ -1584,14 +1710,14 @@
         <w:spacing w:before="0" w:after="0"/>
         <w:rPr/>
       </w:pPr>
-      <w:hyperlink w:anchor="_Tab_8_Bridge_slave_address">
+      <w:hyperlink w:anchor="_Tab_8_Characterization_wor">
         <w:r>
           <w:rPr>
             <w:rStyle w:val="ListLabel1"/>
             <w:color w:val="000000"/>
             <w:sz w:val="24"/>
           </w:rPr>
-          <w:t>Table 8: Bridge slave address map</w:t>
+          <w:t>Table 8: Characterization workloads</w:t>
         </w:r>
         <w:r>
           <w:rPr>
@@ -1609,7 +1735,64 @@
           <w:rPr>
             <w:rStyle w:val="ListLabel1"/>
           </w:rPr>
-          <w:instrText xml:space="preserve"> PAGEREF _Tab_8_Bridge_slave_address \h </w:instrText>
+          <w:instrText xml:space="preserve"> PAGEREF _Tab_8_Characterization_wor \h </w:instrText>
+        </w:r>
+        <w:r>
+          <w:rPr>
+            <w:rStyle w:val="ListLabel1"/>
+          </w:rPr>
+          <w:fldChar w:fldCharType="separate"/>
+        </w:r>
+        <w:r>
+          <w:rPr>
+            <w:rStyle w:val="ListLabel1"/>
+          </w:rPr>
+          <w:t>14</w:t>
+        </w:r>
+        <w:r>
+          <w:rPr>
+            <w:rStyle w:val="ListLabel1"/>
+          </w:rPr>
+          <w:fldChar w:fldCharType="end"/>
+        </w:r>
+      </w:hyperlink>
+    </w:p>
+    <w:p>
+      <w:pPr>
+        <w:pStyle w:val="Normal"/>
+        <w:tabs>
+          <w:tab w:val="clear" w:pos="720"/>
+          <w:tab w:val="right" w:pos="9360" w:leader="dot"/>
+        </w:tabs>
+        <w:spacing w:before="0" w:after="0"/>
+        <w:rPr/>
+      </w:pPr>
+      <w:hyperlink w:anchor="_Tab_9_flows_ours_uart_make">
+        <w:r>
+          <w:rPr>
+            <w:rStyle w:val="ListLabel1"/>
+            <w:color w:val="000000"/>
+            <w:sz w:val="24"/>
+          </w:rPr>
+          <w:t>Table 9: flows-ours-uart make targets</w:t>
+        </w:r>
+        <w:r>
+          <w:rPr>
+            <w:rStyle w:val="ListLabel1"/>
+          </w:rPr>
+          <w:tab/>
+        </w:r>
+        <w:r>
+          <w:rPr>
+            <w:rStyle w:val="ListLabel1"/>
+          </w:rPr>
+          <w:fldChar w:fldCharType="begin"/>
+        </w:r>
+        <w:r>
+          <w:rPr>
+            <w:rStyle w:val="ListLabel1"/>
+          </w:rPr>
+          <w:instrText xml:space="preserve"> PAGEREF _Tab_9_flows_ours_uart_make \h </w:instrText>
         </w:r>
         <w:r>
           <w:rPr>
@@ -1641,14 +1824,14 @@
         <w:spacing w:before="0" w:after="0"/>
         <w:rPr/>
       </w:pPr>
-      <w:hyperlink w:anchor="_Tab_9_Control___status_reg">
+      <w:hyperlink w:anchor="_Tab_10_Bridge_slave_address">
         <w:r>
           <w:rPr>
             <w:rStyle w:val="ListLabel1"/>
             <w:color w:val="000000"/>
             <w:sz w:val="24"/>
           </w:rPr>
-          <w:t>Table 9: Control / status registers</w:t>
+          <w:t>Table 10: Bridge slave address map</w:t>
         </w:r>
         <w:r>
           <w:rPr>
@@ -1666,7 +1849,7 @@
           <w:rPr>
             <w:rStyle w:val="ListLabel1"/>
           </w:rPr>
-          <w:instrText xml:space="preserve"> PAGEREF _Tab_9_Control___status_reg \h </w:instrText>
+          <w:instrText xml:space="preserve"> PAGEREF _Tab_10_Bridge_slave_address \h </w:instrText>
         </w:r>
         <w:r>
           <w:rPr>
@@ -1678,7 +1861,7 @@
           <w:rPr>
             <w:rStyle w:val="ListLabel1"/>
           </w:rPr>
-          <w:t>16</w:t>
+          <w:t>17</w:t>
         </w:r>
         <w:r>
           <w:rPr>
@@ -1698,14 +1881,14 @@
         <w:spacing w:before="0" w:after="0"/>
         <w:rPr/>
       </w:pPr>
-      <w:hyperlink w:anchor="_Tab_10_Characterization_tim">
+      <w:hyperlink w:anchor="_Tab_11_Control___status_reg">
         <w:r>
           <w:rPr>
             <w:rStyle w:val="ListLabel1"/>
             <w:color w:val="000000"/>
             <w:sz w:val="24"/>
           </w:rPr>
-          <w:t>Table 10: Characterization timer registers</w:t>
+          <w:t>Table 11: Control / status registers</w:t>
         </w:r>
         <w:r>
           <w:rPr>
@@ -1723,121 +1906,7 @@
           <w:rPr>
             <w:rStyle w:val="ListLabel1"/>
           </w:rPr>
-          <w:instrText xml:space="preserve"> PAGEREF _Tab_10_Characterization_tim \h </w:instrText>
-        </w:r>
-        <w:r>
-          <w:rPr>
-            <w:rStyle w:val="ListLabel1"/>
-          </w:rPr>
-          <w:fldChar w:fldCharType="separate"/>
-        </w:r>
-        <w:r>
-          <w:rPr>
-            <w:rStyle w:val="ListLabel1"/>
-          </w:rPr>
-          <w:t>18</w:t>
-        </w:r>
-        <w:r>
-          <w:rPr>
-            <w:rStyle w:val="ListLabel1"/>
-          </w:rPr>
-          <w:fldChar w:fldCharType="end"/>
-        </w:r>
-      </w:hyperlink>
-    </w:p>
-    <w:p>
-      <w:pPr>
-        <w:pStyle w:val="Normal"/>
-        <w:tabs>
-          <w:tab w:val="clear" w:pos="720"/>
-          <w:tab w:val="right" w:pos="9360" w:leader="dot"/>
-        </w:tabs>
-        <w:spacing w:before="0" w:after="0"/>
-        <w:rPr/>
-      </w:pPr>
-      <w:hyperlink w:anchor="_Tab_11_Runtime_controller_c">
-        <w:r>
-          <w:rPr>
-            <w:rStyle w:val="ListLabel1"/>
-            <w:color w:val="000000"/>
-            <w:sz w:val="24"/>
-          </w:rPr>
-          <w:t>Table 11: Runtime controller config and live DFI tuning</w:t>
-        </w:r>
-        <w:r>
-          <w:rPr>
-            <w:rStyle w:val="ListLabel1"/>
-          </w:rPr>
-          <w:tab/>
-        </w:r>
-        <w:r>
-          <w:rPr>
-            <w:rStyle w:val="ListLabel1"/>
-          </w:rPr>
-          <w:fldChar w:fldCharType="begin"/>
-        </w:r>
-        <w:r>
-          <w:rPr>
-            <w:rStyle w:val="ListLabel1"/>
-          </w:rPr>
-          <w:instrText xml:space="preserve"> PAGEREF _Tab_11_Runtime_controller_c \h </w:instrText>
-        </w:r>
-        <w:r>
-          <w:rPr>
-            <w:rStyle w:val="ListLabel1"/>
-          </w:rPr>
-          <w:fldChar w:fldCharType="separate"/>
-        </w:r>
-        <w:r>
-          <w:rPr>
-            <w:rStyle w:val="ListLabel1"/>
-          </w:rPr>
-          <w:t>18</w:t>
-        </w:r>
-        <w:r>
-          <w:rPr>
-            <w:rStyle w:val="ListLabel1"/>
-          </w:rPr>
-          <w:fldChar w:fldCharType="end"/>
-        </w:r>
-      </w:hyperlink>
-    </w:p>
-    <w:p>
-      <w:pPr>
-        <w:pStyle w:val="Normal"/>
-        <w:tabs>
-          <w:tab w:val="clear" w:pos="720"/>
-          <w:tab w:val="right" w:pos="9360" w:leader="dot"/>
-        </w:tabs>
-        <w:spacing w:before="0" w:after="0"/>
-        <w:rPr/>
-      </w:pPr>
-      <w:hyperlink w:anchor="_Tab_12_a7ddrphy_calibration">
-        <w:r>
-          <w:rPr>
-            <w:rStyle w:val="ListLabel1"/>
-            <w:color w:val="000000"/>
-            <w:sz w:val="24"/>
-          </w:rPr>
-          <w:t>Table 12: a7ddrphy calibration passthrough</w:t>
-        </w:r>
-        <w:r>
-          <w:rPr>
-            <w:rStyle w:val="ListLabel1"/>
-          </w:rPr>
-          <w:tab/>
-        </w:r>
-        <w:r>
-          <w:rPr>
-            <w:rStyle w:val="ListLabel1"/>
-          </w:rPr>
-          <w:fldChar w:fldCharType="begin"/>
-        </w:r>
-        <w:r>
-          <w:rPr>
-            <w:rStyle w:val="ListLabel1"/>
-          </w:rPr>
-          <w:instrText xml:space="preserve"> PAGEREF _Tab_12_a7ddrphy_calibration \h </w:instrText>
+          <w:instrText xml:space="preserve"> PAGEREF _Tab_11_Control___status_reg \h </w:instrText>
         </w:r>
         <w:r>
           <w:rPr>
@@ -1869,14 +1938,14 @@
         <w:spacing w:before="0" w:after="0"/>
         <w:rPr/>
       </w:pPr>
-      <w:hyperlink w:anchor="_Tab_13_Write_engine_config_">
+      <w:hyperlink w:anchor="_Tab_12_Characterization_tim">
         <w:r>
           <w:rPr>
             <w:rStyle w:val="ListLabel1"/>
             <w:color w:val="000000"/>
             <w:sz w:val="24"/>
           </w:rPr>
-          <w:t>Table 13: Write-engine config (read engine identical at +0x80)</w:t>
+          <w:t>Table 12: Characterization timer registers</w:t>
         </w:r>
         <w:r>
           <w:rPr>
@@ -1894,64 +1963,7 @@
           <w:rPr>
             <w:rStyle w:val="ListLabel1"/>
           </w:rPr>
-          <w:instrText xml:space="preserve"> PAGEREF _Tab_13_Write_engine_config_ \h </w:instrText>
-        </w:r>
-        <w:r>
-          <w:rPr>
-            <w:rStyle w:val="ListLabel1"/>
-          </w:rPr>
-          <w:fldChar w:fldCharType="separate"/>
-        </w:r>
-        <w:r>
-          <w:rPr>
-            <w:rStyle w:val="ListLabel1"/>
-          </w:rPr>
-          <w:t>19</w:t>
-        </w:r>
-        <w:r>
-          <w:rPr>
-            <w:rStyle w:val="ListLabel1"/>
-          </w:rPr>
-          <w:fldChar w:fldCharType="end"/>
-        </w:r>
-      </w:hyperlink>
-    </w:p>
-    <w:p>
-      <w:pPr>
-        <w:pStyle w:val="Normal"/>
-        <w:tabs>
-          <w:tab w:val="clear" w:pos="720"/>
-          <w:tab w:val="right" w:pos="9360" w:leader="dot"/>
-        </w:tabs>
-        <w:spacing w:before="0" w:after="0"/>
-        <w:rPr/>
-      </w:pPr>
-      <w:hyperlink w:anchor="_Tab_14_Perf_observability__">
-        <w:r>
-          <w:rPr>
-            <w:rStyle w:val="ListLabel1"/>
-            <w:color w:val="000000"/>
-            <w:sz w:val="24"/>
-          </w:rPr>
-          <w:t>Table 14: Perf observability (bin b covers [2^b, 2^(b+1)) cycles)</w:t>
-        </w:r>
-        <w:r>
-          <w:rPr>
-            <w:rStyle w:val="ListLabel1"/>
-          </w:rPr>
-          <w:tab/>
-        </w:r>
-        <w:r>
-          <w:rPr>
-            <w:rStyle w:val="ListLabel1"/>
-          </w:rPr>
-          <w:fldChar w:fldCharType="begin"/>
-        </w:r>
-        <w:r>
-          <w:rPr>
-            <w:rStyle w:val="ListLabel1"/>
-          </w:rPr>
-          <w:instrText xml:space="preserve"> PAGEREF _Tab_14_Perf_observability__ \h </w:instrText>
+          <w:instrText xml:space="preserve"> PAGEREF _Tab_12_Characterization_tim \h </w:instrText>
         </w:r>
         <w:r>
           <w:rPr>
@@ -1983,14 +1995,14 @@
         <w:spacing w:before="0" w:after="0"/>
         <w:rPr/>
       </w:pPr>
-      <w:hyperlink w:anchor="_Tab_15_Simulation_testbench">
+      <w:hyperlink w:anchor="_Tab_13_Runtime_controller_c">
         <w:r>
           <w:rPr>
             <w:rStyle w:val="ListLabel1"/>
             <w:color w:val="000000"/>
             <w:sz w:val="24"/>
           </w:rPr>
-          <w:t>Table 15: Simulation testbenches</w:t>
+          <w:t>Table 13: Runtime controller config and live DFI tuning</w:t>
         </w:r>
         <w:r>
           <w:rPr>
@@ -2008,7 +2020,7 @@
           <w:rPr>
             <w:rStyle w:val="ListLabel1"/>
           </w:rPr>
-          <w:instrText xml:space="preserve"> PAGEREF _Tab_15_Simulation_testbench \h </w:instrText>
+          <w:instrText xml:space="preserve"> PAGEREF _Tab_13_Runtime_controller_c \h </w:instrText>
         </w:r>
         <w:r>
           <w:rPr>
@@ -2040,14 +2052,14 @@
         <w:spacing w:before="0" w:after="0"/>
         <w:rPr/>
       </w:pPr>
-      <w:hyperlink w:anchor="_Tab_16_Known_issues_and_bou">
+      <w:hyperlink w:anchor="_Tab_14_a7ddrphy_calibration">
         <w:r>
           <w:rPr>
             <w:rStyle w:val="ListLabel1"/>
             <w:color w:val="000000"/>
             <w:sz w:val="24"/>
           </w:rPr>
-          <w:t>Table 16: Known issues and bounds</w:t>
+          <w:t>Table 14: a7ddrphy calibration passthrough</w:t>
         </w:r>
         <w:r>
           <w:rPr>
@@ -2065,7 +2077,121 @@
           <w:rPr>
             <w:rStyle w:val="ListLabel1"/>
           </w:rPr>
-          <w:instrText xml:space="preserve"> PAGEREF _Tab_16_Known_issues_and_bou \h </w:instrText>
+          <w:instrText xml:space="preserve"> PAGEREF _Tab_14_a7ddrphy_calibration \h </w:instrText>
+        </w:r>
+        <w:r>
+          <w:rPr>
+            <w:rStyle w:val="ListLabel1"/>
+          </w:rPr>
+          <w:fldChar w:fldCharType="separate"/>
+        </w:r>
+        <w:r>
+          <w:rPr>
+            <w:rStyle w:val="ListLabel1"/>
+          </w:rPr>
+          <w:t>22</w:t>
+        </w:r>
+        <w:r>
+          <w:rPr>
+            <w:rStyle w:val="ListLabel1"/>
+          </w:rPr>
+          <w:fldChar w:fldCharType="end"/>
+        </w:r>
+      </w:hyperlink>
+    </w:p>
+    <w:p>
+      <w:pPr>
+        <w:pStyle w:val="Normal"/>
+        <w:tabs>
+          <w:tab w:val="clear" w:pos="720"/>
+          <w:tab w:val="right" w:pos="9360" w:leader="dot"/>
+        </w:tabs>
+        <w:spacing w:before="0" w:after="0"/>
+        <w:rPr/>
+      </w:pPr>
+      <w:hyperlink w:anchor="_Tab_15_Write_engine_config_">
+        <w:r>
+          <w:rPr>
+            <w:rStyle w:val="ListLabel1"/>
+            <w:color w:val="000000"/>
+            <w:sz w:val="24"/>
+          </w:rPr>
+          <w:t>Table 15: Write-engine config (read engine identical at +0x80)</w:t>
+        </w:r>
+        <w:r>
+          <w:rPr>
+            <w:rStyle w:val="ListLabel1"/>
+          </w:rPr>
+          <w:tab/>
+        </w:r>
+        <w:r>
+          <w:rPr>
+            <w:rStyle w:val="ListLabel1"/>
+          </w:rPr>
+          <w:fldChar w:fldCharType="begin"/>
+        </w:r>
+        <w:r>
+          <w:rPr>
+            <w:rStyle w:val="ListLabel1"/>
+          </w:rPr>
+          <w:instrText xml:space="preserve"> PAGEREF _Tab_15_Write_engine_config_ \h </w:instrText>
+        </w:r>
+        <w:r>
+          <w:rPr>
+            <w:rStyle w:val="ListLabel1"/>
+          </w:rPr>
+          <w:fldChar w:fldCharType="separate"/>
+        </w:r>
+        <w:r>
+          <w:rPr>
+            <w:rStyle w:val="ListLabel1"/>
+          </w:rPr>
+          <w:t>22</w:t>
+        </w:r>
+        <w:r>
+          <w:rPr>
+            <w:rStyle w:val="ListLabel1"/>
+          </w:rPr>
+          <w:fldChar w:fldCharType="end"/>
+        </w:r>
+      </w:hyperlink>
+    </w:p>
+    <w:p>
+      <w:pPr>
+        <w:pStyle w:val="Normal"/>
+        <w:tabs>
+          <w:tab w:val="clear" w:pos="720"/>
+          <w:tab w:val="right" w:pos="9360" w:leader="dot"/>
+        </w:tabs>
+        <w:spacing w:before="0" w:after="0"/>
+        <w:rPr/>
+      </w:pPr>
+      <w:hyperlink w:anchor="_Tab_16_Perf_observability__">
+        <w:r>
+          <w:rPr>
+            <w:rStyle w:val="ListLabel1"/>
+            <w:color w:val="000000"/>
+            <w:sz w:val="24"/>
+          </w:rPr>
+          <w:t>Table 16: Perf observability (bin b covers [2^b, 2^(b+1)) cycles)</w:t>
+        </w:r>
+        <w:r>
+          <w:rPr>
+            <w:rStyle w:val="ListLabel1"/>
+          </w:rPr>
+          <w:tab/>
+        </w:r>
+        <w:r>
+          <w:rPr>
+            <w:rStyle w:val="ListLabel1"/>
+          </w:rPr>
+          <w:fldChar w:fldCharType="begin"/>
+        </w:r>
+        <w:r>
+          <w:rPr>
+            <w:rStyle w:val="ListLabel1"/>
+          </w:rPr>
+          <w:instrText xml:space="preserve"> PAGEREF _Tab_16_Perf_observability__ \h </w:instrText>
         </w:r>
         <w:r>
           <w:rPr>
@@ -2090,34 +2216,6 @@
     <w:p>
       <w:pPr>
         <w:pStyle w:val="Normal"/>
-        <w:rPr/>
-      </w:pPr>
-      <w:r>
-        <w:rPr/>
-      </w:r>
-      <w:r>
-        <w:br w:type="page"/>
-      </w:r>
-    </w:p>
-    <w:p>
-      <w:pPr>
-        <w:pStyle w:val="Normal"/>
-        <w:spacing w:before="0" w:after="240"/>
-        <w:rPr/>
-      </w:pPr>
-      <w:r>
-        <w:rPr>
-          <w:rFonts w:ascii="Calibri Light" w:hAnsi="Calibri Light"/>
-          <w:b w:val="0"/>
-          <w:color w:val="2E74B5"/>
-          <w:sz w:val="32"/>
-        </w:rPr>
-        <w:t>List of Waveforms</w:t>
-      </w:r>
-    </w:p>
-    <w:p>
-      <w:pPr>
-        <w:pStyle w:val="Normal"/>
         <w:tabs>
           <w:tab w:val="clear" w:pos="720"/>
           <w:tab w:val="right" w:pos="9360" w:leader="dot"/>
@@ -2125,14 +2223,14 @@
         <w:spacing w:before="0" w:after="0"/>
         <w:rPr/>
       </w:pPr>
-      <w:hyperlink w:anchor="_Wave_4_1_Engine_Kick_and_Poll">
+      <w:hyperlink w:anchor="_Tab_17_Simulation_testbench">
         <w:r>
           <w:rPr>
             <w:rStyle w:val="ListLabel1"/>
             <w:color w:val="000000"/>
             <w:sz w:val="24"/>
           </w:rPr>
-          <w:t>Waveform 4.1: Engine Kick and Poll</w:t>
+          <w:t>Table 17: Simulation testbenches</w:t>
         </w:r>
         <w:r>
           <w:rPr>
@@ -2150,7 +2248,7 @@
           <w:rPr>
             <w:rStyle w:val="ListLabel1"/>
           </w:rPr>
-          <w:instrText xml:space="preserve"> PAGEREF _Wave_4_1_Engine_Kick_and_Poll \h </w:instrText>
+          <w:instrText xml:space="preserve"> PAGEREF _Tab_17_Simulation_testbench \h </w:instrText>
         </w:r>
         <w:r>
           <w:rPr>
@@ -2162,7 +2260,149 @@
           <w:rPr>
             <w:rStyle w:val="ListLabel1"/>
           </w:rPr>
-          <w:t>16</w:t>
+          <w:t>24</w:t>
+        </w:r>
+        <w:r>
+          <w:rPr>
+            <w:rStyle w:val="ListLabel1"/>
+          </w:rPr>
+          <w:fldChar w:fldCharType="end"/>
+        </w:r>
+      </w:hyperlink>
+    </w:p>
+    <w:p>
+      <w:pPr>
+        <w:pStyle w:val="Normal"/>
+        <w:tabs>
+          <w:tab w:val="clear" w:pos="720"/>
+          <w:tab w:val="right" w:pos="9360" w:leader="dot"/>
+        </w:tabs>
+        <w:spacing w:before="0" w:after="0"/>
+        <w:rPr/>
+      </w:pPr>
+      <w:hyperlink w:anchor="_Tab_18_Known_issues_and_bou">
+        <w:r>
+          <w:rPr>
+            <w:rStyle w:val="ListLabel1"/>
+            <w:color w:val="000000"/>
+            <w:sz w:val="24"/>
+          </w:rPr>
+          <w:t>Table 18: Known issues and bounds</w:t>
+        </w:r>
+        <w:r>
+          <w:rPr>
+            <w:rStyle w:val="ListLabel1"/>
+          </w:rPr>
+          <w:tab/>
+        </w:r>
+        <w:r>
+          <w:rPr>
+            <w:rStyle w:val="ListLabel1"/>
+          </w:rPr>
+          <w:fldChar w:fldCharType="begin"/>
+        </w:r>
+        <w:r>
+          <w:rPr>
+            <w:rStyle w:val="ListLabel1"/>
+          </w:rPr>
+          <w:instrText xml:space="preserve"> PAGEREF _Tab_18_Known_issues_and_bou \h </w:instrText>
+        </w:r>
+        <w:r>
+          <w:rPr>
+            <w:rStyle w:val="ListLabel1"/>
+          </w:rPr>
+          <w:fldChar w:fldCharType="separate"/>
+        </w:r>
+        <w:r>
+          <w:rPr>
+            <w:rStyle w:val="ListLabel1"/>
+          </w:rPr>
+          <w:t>25</w:t>
+        </w:r>
+        <w:r>
+          <w:rPr>
+            <w:rStyle w:val="ListLabel1"/>
+          </w:rPr>
+          <w:fldChar w:fldCharType="end"/>
+        </w:r>
+      </w:hyperlink>
+    </w:p>
+    <w:p>
+      <w:pPr>
+        <w:pStyle w:val="Normal"/>
+        <w:rPr/>
+      </w:pPr>
+      <w:r>
+        <w:rPr/>
+      </w:r>
+      <w:r>
+        <w:br w:type="page"/>
+      </w:r>
+    </w:p>
+    <w:p>
+      <w:pPr>
+        <w:pStyle w:val="Normal"/>
+        <w:spacing w:before="0" w:after="240"/>
+        <w:rPr/>
+      </w:pPr>
+      <w:r>
+        <w:rPr>
+          <w:rFonts w:ascii="Calibri Light" w:hAnsi="Calibri Light"/>
+          <w:b w:val="0"/>
+          <w:color w:val="2E74B5"/>
+          <w:sz w:val="32"/>
+        </w:rPr>
+        <w:t>List of Waveforms</w:t>
+      </w:r>
+    </w:p>
+    <w:p>
+      <w:pPr>
+        <w:pStyle w:val="Normal"/>
+        <w:tabs>
+          <w:tab w:val="clear" w:pos="720"/>
+          <w:tab w:val="right" w:pos="9360" w:leader="dot"/>
+        </w:tabs>
+        <w:spacing w:before="0" w:after="0"/>
+        <w:rPr/>
+      </w:pPr>
+      <w:hyperlink w:anchor="_Wave_5_1_Engine_Kick_and_Poll">
+        <w:r>
+          <w:rPr>
+            <w:rStyle w:val="ListLabel1"/>
+            <w:color w:val="000000"/>
+            <w:sz w:val="24"/>
+          </w:rPr>
+          <w:t>Waveform 5.1: Engine Kick and Poll</w:t>
+        </w:r>
+        <w:r>
+          <w:rPr>
+            <w:rStyle w:val="ListLabel1"/>
+          </w:rPr>
+          <w:tab/>
+        </w:r>
+        <w:r>
+          <w:rPr>
+            <w:rStyle w:val="ListLabel1"/>
+          </w:rPr>
+          <w:fldChar w:fldCharType="begin"/>
+        </w:r>
+        <w:r>
+          <w:rPr>
+            <w:rStyle w:val="ListLabel1"/>
+          </w:rPr>
+          <w:instrText xml:space="preserve"> PAGEREF _Wave_5_1_Engine_Kick_and_Poll \h </w:instrText>
+        </w:r>
+        <w:r>
+          <w:rPr>
+            <w:rStyle w:val="ListLabel1"/>
+          </w:rPr>
+          <w:fldChar w:fldCharType="separate"/>
+        </w:r>
+        <w:r>
+          <w:rPr>
+            <w:rStyle w:val="ListLabel1"/>
+          </w:rPr>
+          <w:t>19</w:t>
         </w:r>
         <w:r>
           <w:rPr>
@@ -2277,7 +2517,7 @@
         <w:spacing w:before="360" w:after="120"/>
         <w:rPr/>
       </w:pPr>
-      <w:bookmarkStart w:id="0" w:name="__RefHeading___Toc5112_3428382280"/>
+      <w:bookmarkStart w:id="0" w:name="__RefHeading___Toc5444_4029633280"/>
       <w:bookmarkEnd w:id="0"/>
       <w:r>
         <w:rPr>
@@ -2487,7 +2727,7 @@
         <w:spacing w:before="280" w:after="80"/>
         <w:rPr/>
       </w:pPr>
-      <w:bookmarkStart w:id="1" w:name="__RefHeading___Toc5114_3428382280"/>
+      <w:bookmarkStart w:id="1" w:name="__RefHeading___Toc5446_4029633280"/>
       <w:bookmarkStart w:id="2" w:name="references"/>
       <w:bookmarkEnd w:id="1"/>
       <w:r>
@@ -3130,7 +3370,7 @@
         <w:spacing w:before="280" w:after="80"/>
         <w:rPr/>
       </w:pPr>
-      <w:bookmarkStart w:id="5" w:name="__RefHeading___Toc5116_3428382280"/>
+      <w:bookmarkStart w:id="5" w:name="__RefHeading___Toc5448_4029633280"/>
       <w:bookmarkStart w:id="6" w:name="terminology"/>
       <w:bookmarkEnd w:id="5"/>
       <w:r>
@@ -3381,7 +3621,7 @@
         <w:spacing w:before="280" w:after="80"/>
         <w:rPr/>
       </w:pPr>
-      <w:bookmarkStart w:id="8" w:name="__RefHeading___Toc5118_3428382280"/>
+      <w:bookmarkStart w:id="8" w:name="__RefHeading___Toc5450_4029633280"/>
       <w:bookmarkEnd w:id="8"/>
       <w:r>
         <w:rPr>
@@ -3655,7 +3895,7 @@
         <w:spacing w:before="360" w:after="120"/>
         <w:rPr/>
       </w:pPr>
-      <w:bookmarkStart w:id="12" w:name="__RefHeading___Toc5120_3428382280"/>
+      <w:bookmarkStart w:id="12" w:name="__RefHeading___Toc5452_4029633280"/>
       <w:bookmarkEnd w:id="12"/>
       <w:r>
         <w:rPr>
@@ -3685,7 +3925,7 @@
         <w:spacing w:before="280" w:after="80"/>
         <w:rPr/>
       </w:pPr>
-      <w:bookmarkStart w:id="13" w:name="__RefHeading___Toc5122_3428382280"/>
+      <w:bookmarkStart w:id="13" w:name="__RefHeading___Toc5454_4029633280"/>
       <w:bookmarkStart w:id="14" w:name="what-it-characterizes"/>
       <w:bookmarkEnd w:id="13"/>
       <w:r>
@@ -3769,7 +4009,7 @@
         <w:rPr>
           <w:sz w:val="20"/>
         </w:rPr>
-        <w:t xml:space="preserve"> drives the harness over the FTDI USB-UART (115200 8N1). The same host programs run against a cocotb simulation (Chapter 5).</w:t>
+        <w:t xml:space="preserve"> drives the harness over the FTDI USB-UART (115200 8N1). The same host programs run against a cocotb simulation (Chapter 6).</w:t>
       </w:r>
       <w:bookmarkEnd w:id="14"/>
     </w:p>
@@ -3782,7 +4022,7 @@
         <w:spacing w:before="280" w:after="80"/>
         <w:rPr/>
       </w:pPr>
-      <w:bookmarkStart w:id="15" w:name="__RefHeading___Toc5124_3428382280"/>
+      <w:bookmarkStart w:id="15" w:name="__RefHeading___Toc5456_4029633280"/>
       <w:bookmarkStart w:id="16" w:name="the-three-flows"/>
       <w:bookmarkEnd w:id="15"/>
       <w:r>
@@ -4362,7 +4602,7 @@
         <w:spacing w:before="280" w:after="80"/>
         <w:rPr/>
       </w:pPr>
-      <w:bookmarkStart w:id="18" w:name="__RefHeading___Toc5126_3428382280"/>
+      <w:bookmarkStart w:id="18" w:name="__RefHeading___Toc5458_4029633280"/>
       <w:bookmarkEnd w:id="18"/>
       <w:r>
         <w:rPr>
@@ -4943,7 +5183,7 @@
         <w:spacing w:before="280" w:after="80"/>
         <w:rPr/>
       </w:pPr>
-      <w:bookmarkStart w:id="21" w:name="__RefHeading___Toc5128_3428382280"/>
+      <w:bookmarkStart w:id="21" w:name="__RefHeading___Toc5460_4029633280"/>
       <w:bookmarkEnd w:id="21"/>
       <w:r>
         <w:rPr>
@@ -5681,7 +5921,7 @@
         <w:spacing w:before="360" w:after="120"/>
         <w:rPr/>
       </w:pPr>
-      <w:bookmarkStart w:id="23" w:name="__RefHeading___Toc5130_3428382280"/>
+      <w:bookmarkStart w:id="23" w:name="__RefHeading___Toc5462_4029633280"/>
       <w:bookmarkStart w:id="24" w:name="how-it-works"/>
       <w:bookmarkEnd w:id="23"/>
       <w:r>
@@ -5712,7 +5952,7 @@
         <w:spacing w:before="280" w:after="80"/>
         <w:rPr/>
       </w:pPr>
-      <w:bookmarkStart w:id="25" w:name="__RefHeading___Toc5132_3428382280"/>
+      <w:bookmarkStart w:id="25" w:name="__RefHeading___Toc5464_4029633280"/>
       <w:bookmarkStart w:id="26" w:name="the-transport-spine"/>
       <w:bookmarkEnd w:id="25"/>
       <w:r>
@@ -5752,7 +5992,7 @@
         <w:spacing w:before="200" w:after="80"/>
         <w:rPr/>
       </w:pPr>
-      <w:bookmarkStart w:id="27" w:name="__RefHeading___Toc5134_3428382280"/>
+      <w:bookmarkStart w:id="27" w:name="__RefHeading___Toc5466_4029633280"/>
       <w:bookmarkStart w:id="28" w:name="X1f5fcbc2250ac5068647b17b4e3675239762280"/>
       <w:bookmarkStart w:id="29" w:name="_Fig_1_DDR2_Characterizatio"/>
       <w:bookmarkEnd w:id="27"/>
@@ -5974,7 +6214,7 @@
         <w:spacing w:before="280" w:after="80"/>
         <w:rPr/>
       </w:pPr>
-      <w:bookmarkStart w:id="30" w:name="__RefHeading___Toc5136_3428382280"/>
+      <w:bookmarkStart w:id="30" w:name="__RefHeading___Toc5468_4029633280"/>
       <w:bookmarkStart w:id="31" w:name="the-14-axil-bridge"/>
       <w:bookmarkEnd w:id="30"/>
       <w:r>
@@ -6038,7 +6278,7 @@
         <w:rPr>
           <w:sz w:val="20"/>
         </w:rPr>
-        <w:t>, four slaves). It decodes the four windows in Chapter 4 and routes each host transaction to the right slave via per-slave adapters.</w:t>
+        <w:t>, four slaves). It decodes the four windows in Chapter 5 and routes each host transaction to the right slave via per-slave adapters.</w:t>
       </w:r>
       <w:bookmarkEnd w:id="31"/>
     </w:p>
@@ -6051,7 +6291,7 @@
         <w:spacing w:before="280" w:after="80"/>
         <w:rPr/>
       </w:pPr>
-      <w:bookmarkStart w:id="32" w:name="__RefHeading___Toc5138_3428382280"/>
+      <w:bookmarkStart w:id="32" w:name="__RefHeading___Toc5470_4029633280"/>
       <w:bookmarkEnd w:id="32"/>
       <w:r>
         <w:rPr>
@@ -6575,7 +6815,7 @@
                 <w:szCs w:val="24"/>
                 <w:lang w:val="en-US" w:eastAsia="en-US" w:bidi="ar-SA"/>
               </w:rPr>
-              <w:t>The AXIL CSR slave (Chapter 4). Hand-written (self-clearing pulses, latches, PHY passthrough).</w:t>
+              <w:t>The AXIL CSR slave (Chapter 5). Hand-written (self-clearing pulses, latches, PHY passthrough).</w:t>
             </w:r>
           </w:p>
         </w:tc>
@@ -6742,7 +6982,7 @@
         <w:spacing w:before="280" w:after="80"/>
         <w:rPr/>
       </w:pPr>
-      <w:bookmarkStart w:id="35" w:name="__RefHeading___Toc5140_3428382280"/>
+      <w:bookmarkStart w:id="35" w:name="__RefHeading___Toc5472_4029633280"/>
       <w:bookmarkEnd w:id="35"/>
       <w:r>
         <w:rPr>
@@ -6912,7 +7152,7 @@
         <w:rPr>
           <w:sz w:val="20"/>
         </w:rPr>
-        <w:t xml:space="preserve"> — observe the internal AXI wires to produce the producer/backpressure/starve/idle buckets and the latency histogram read back in Chapter 4.</w:t>
+        <w:t xml:space="preserve"> — observe the internal AXI wires to produce the producer/backpressure/starve/idle buckets and the latency histogram read back in Chapter 5.</w:t>
       </w:r>
     </w:p>
     <w:p>
@@ -6924,7 +7164,7 @@
         <w:spacing w:before="280" w:after="80"/>
         <w:rPr/>
       </w:pPr>
-      <w:bookmarkStart w:id="36" w:name="__RefHeading___Toc5142_3428382280"/>
+      <w:bookmarkStart w:id="36" w:name="__RefHeading___Toc5474_4029633280"/>
       <w:bookmarkStart w:id="37" w:name="the-controller-dfi-and-phy-black-boxes"/>
       <w:bookmarkEnd w:id="36"/>
       <w:r>
@@ -7034,7 +7274,7 @@
         <w:rPr>
           <w:sz w:val="20"/>
         </w:rPr>
-        <w:t xml:space="preserve"> (it uses Xilinx SERDES/IDELAY primitives); the sim connects at the DFI level with a behavioral model instead (Chapter 5). On hardware, a7ddrphy calibration is driven by firmware (the host) over the PHY-CSR passthrough window — there is no hardware leveling FSM.</w:t>
+        <w:t xml:space="preserve"> (it uses Xilinx SERDES/IDELAY primitives); the sim connects at the DFI level with a behavioral model instead (Chapter 6). On hardware, a7ddrphy calibration is driven by firmware (the host) over the PHY-CSR passthrough window — there is no hardware leveling FSM.</w:t>
       </w:r>
       <w:bookmarkEnd w:id="24"/>
       <w:bookmarkEnd w:id="37"/>
@@ -7046,8 +7286,8 @@
         <w:spacing w:before="360" w:after="120"/>
         <w:rPr/>
       </w:pPr>
-      <w:bookmarkStart w:id="38" w:name="__RefHeading___Toc5144_3428382280"/>
-      <w:bookmarkStart w:id="39" w:name="build-and-run"/>
+      <w:bookmarkStart w:id="38" w:name="__RefHeading___Toc5476_4029633280"/>
+      <w:bookmarkStart w:id="39" w:name="test-methodology"/>
       <w:bookmarkEnd w:id="38"/>
       <w:r>
         <w:rPr>
@@ -7065,7 +7305,7 @@
           <w:sz w:val="32"/>
         </w:rPr>
         <w:tab/>
-        <w:t>Build and Run</w:t>
+        <w:t>Test Methodology</w:t>
       </w:r>
     </w:p>
     <w:p>
@@ -7077,117 +7317,7 @@
         <w:rPr>
           <w:sz w:val="20"/>
         </w:rPr>
-        <w:t xml:space="preserve">All commands assume the Python environment is sourced (sets </w:t>
-      </w:r>
-      <w:r>
-        <w:rPr>
-          <w:rStyle w:val="VerbatimChar"/>
-          <w:sz w:val="20"/>
-        </w:rPr>
-        <w:t>REPO_ROOT</w:t>
-      </w:r>
-      <w:r>
-        <w:rPr>
-          <w:sz w:val="20"/>
-        </w:rPr>
-        <w:t xml:space="preserve">, </w:t>
-      </w:r>
-      <w:r>
-        <w:rPr>
-          <w:rStyle w:val="VerbatimChar"/>
-          <w:sz w:val="20"/>
-        </w:rPr>
-        <w:t>SIM=verilator</w:t>
-      </w:r>
-      <w:r>
-        <w:rPr>
-          <w:sz w:val="20"/>
-        </w:rPr>
-        <w:t xml:space="preserve">, </w:t>
-      </w:r>
-      <w:r>
-        <w:rPr>
-          <w:rStyle w:val="VerbatimChar"/>
-          <w:sz w:val="20"/>
-        </w:rPr>
-        <w:t>PATH</w:t>
-      </w:r>
-      <w:r>
-        <w:rPr>
-          <w:sz w:val="20"/>
-        </w:rPr>
-        <w:t xml:space="preserve">, </w:t>
-      </w:r>
-      <w:r>
-        <w:rPr>
-          <w:rStyle w:val="VerbatimChar"/>
-          <w:sz w:val="20"/>
-        </w:rPr>
-        <w:t>PYTHONPATH</w:t>
-      </w:r>
-      <w:r>
-        <w:rPr>
-          <w:sz w:val="20"/>
-        </w:rPr>
-        <w:t>):</w:t>
-      </w:r>
-    </w:p>
-    <w:p>
-      <w:pPr>
-        <w:pStyle w:val="SourceCode"/>
-        <w:rPr/>
-      </w:pPr>
-      <w:r>
-        <w:rPr>
-          <w:rStyle w:val="BuiltInTok"/>
-        </w:rPr>
-        <w:t>cd</w:t>
-      </w:r>
-      <w:r>
-        <w:rPr>
-          <w:rStyle w:val="NormalTok"/>
-        </w:rPr>
-        <w:t xml:space="preserve"> /path/to/RTLDesignSherpa </w:t>
-      </w:r>
-      <w:r>
-        <w:rPr>
-          <w:rStyle w:val="KeywordTok"/>
-        </w:rPr>
-        <w:t>&amp;&amp;</w:t>
-      </w:r>
-      <w:r>
-        <w:rPr>
-          <w:rStyle w:val="NormalTok"/>
-        </w:rPr>
-        <w:t xml:space="preserve"> </w:t>
-      </w:r>
-      <w:r>
-        <w:rPr>
-          <w:rStyle w:val="BuiltInTok"/>
-        </w:rPr>
-        <w:t>source</w:t>
-      </w:r>
-      <w:r>
-        <w:rPr>
-          <w:rStyle w:val="NormalTok"/>
-        </w:rPr>
-        <w:t xml:space="preserve"> env_python</w:t>
-      </w:r>
-      <w:r>
-        <w:rPr/>
-        <w:br/>
-      </w:r>
-      <w:r>
-        <w:rPr>
-          <w:rStyle w:val="BuiltInTok"/>
-        </w:rPr>
-        <w:t>cd</w:t>
-      </w:r>
-      <w:r>
-        <w:rPr>
-          <w:rStyle w:val="NormalTok"/>
-        </w:rPr>
-        <w:t xml:space="preserve"> projects/NexysA7/ddr2-characterization/flows-ours-uart</w:t>
+        <w:t>This chapter describes what is exercised on the FPGA block (Figure 2.1) and how throughput, latency, and data integrity are measured.</w:t>
       </w:r>
     </w:p>
     <w:p>
@@ -7199,8 +7329,8 @@
         <w:spacing w:before="280" w:after="80"/>
         <w:rPr/>
       </w:pPr>
-      <w:bookmarkStart w:id="40" w:name="__RefHeading___Toc5146_3428382280"/>
-      <w:bookmarkStart w:id="41" w:name="flows-ours-uart-make-targets"/>
+      <w:bookmarkStart w:id="40" w:name="__RefHeading___Toc5478_4029633280"/>
+      <w:bookmarkStart w:id="41" w:name="what-is-under-test"/>
       <w:bookmarkEnd w:id="40"/>
       <w:r>
         <w:rPr>
@@ -7218,23 +7348,7 @@
           <w:sz w:val="28"/>
         </w:rPr>
         <w:tab/>
-      </w:r>
-      <w:r>
-        <w:rPr>
-          <w:rStyle w:val="VerbatimChar"/>
-          <w:b/>
-          <w:color w:val="228B22"/>
-          <w:sz w:val="28"/>
-        </w:rPr>
-        <w:t>flows-ours-uart</w:t>
-      </w:r>
-      <w:r>
-        <w:rPr>
-          <w:b/>
-          <w:color w:val="228B22"/>
-          <w:sz w:val="28"/>
-        </w:rPr>
-        <w:t xml:space="preserve"> make targets</w:t>
+        <w:t>What is under test</w:t>
       </w:r>
     </w:p>
     <w:p>
@@ -7244,42 +7358,55 @@
       </w:pPr>
       <w:r>
         <w:rPr>
-          <w:rStyle w:val="VerbatimChar"/>
-          <w:sz w:val="20"/>
-        </w:rPr>
-        <w:t>UART ?= /dev/ttyUSB1</w:t>
-      </w:r>
-      <w:r>
-        <w:rPr>
-          <w:sz w:val="20"/>
-        </w:rPr>
-        <w:t xml:space="preserve">, </w:t>
-      </w:r>
-      <w:r>
-        <w:rPr>
-          <w:rStyle w:val="VerbatimChar"/>
-          <w:sz w:val="20"/>
-        </w:rPr>
-        <w:t>BAUD ?= 115200</w:t>
-      </w:r>
-      <w:r>
-        <w:rPr>
-          <w:sz w:val="20"/>
-        </w:rPr>
-        <w:t xml:space="preserve">, </w:t>
-      </w:r>
-      <w:r>
-        <w:rPr>
-          <w:rStyle w:val="VerbatimChar"/>
-          <w:sz w:val="20"/>
-        </w:rPr>
-        <w:t>VIVADO ?= vivado</w:t>
-      </w:r>
-      <w:r>
-        <w:rPr>
-          <w:sz w:val="20"/>
-        </w:rPr>
-        <w:t>.</w:t>
+          <w:sz w:val="20"/>
+        </w:rPr>
+        <w:t xml:space="preserve">The </w:t>
+      </w:r>
+      <w:r>
+        <w:rPr>
+          <w:b/>
+          <w:bCs/>
+          <w:sz w:val="20"/>
+        </w:rPr>
+        <w:t>pumice</w:t>
+      </w:r>
+      <w:r>
+        <w:rPr>
+          <w:sz w:val="20"/>
+        </w:rPr>
+        <w:t xml:space="preserve"> memory controller (black box) driving the real onboard DDR2, stimulated by the two master-side AXI4 engines. Every measurement is taken on the internal AXI wires between the engines and the controller, so the numbers reflect the controller + PHY + device as a whole.</w:t>
+      </w:r>
+      <w:bookmarkEnd w:id="41"/>
+    </w:p>
+    <w:p>
+      <w:pPr>
+        <w:pStyle w:val="Heading2"/>
+        <w:pBdr>
+          <w:bottom w:val="single" w:sz="12" w:space="0" w:color="228B22"/>
+        </w:pBdr>
+        <w:spacing w:before="280" w:after="80"/>
+        <w:rPr/>
+      </w:pPr>
+      <w:bookmarkStart w:id="42" w:name="__RefHeading___Toc5480_4029633280"/>
+      <w:bookmarkStart w:id="43" w:name="what-is-measured-and-how"/>
+      <w:bookmarkEnd w:id="42"/>
+      <w:r>
+        <w:rPr>
+          <w:rStyle w:val="SectionNumber"/>
+          <w:b/>
+          <w:color w:val="228B22"/>
+          <w:sz w:val="28"/>
+        </w:rPr>
+        <w:t>4.2</w:t>
+      </w:r>
+      <w:r>
+        <w:rPr>
+          <w:b/>
+          <w:color w:val="228B22"/>
+          <w:sz w:val="28"/>
+        </w:rPr>
+        <w:tab/>
+        <w:t>What is measured, and how</w:t>
       </w:r>
     </w:p>
     <w:p>
@@ -7287,12 +7414,1636 @@
         <w:pStyle w:val="TableCaption"/>
         <w:rPr/>
       </w:pPr>
-      <w:bookmarkStart w:id="42" w:name="_Tab_7_flows_ours_uart_make"/>
+      <w:bookmarkStart w:id="44" w:name="_Tab_7_What_is_measured"/>
+      <w:r>
+        <w:rPr/>
+        <w:t>What is measured</w:t>
+      </w:r>
+      <w:bookmarkEnd w:id="44"/>
+    </w:p>
+    <w:tbl>
+      <w:tblPr>
+        <w:tblStyle w:val="Table"/>
+        <w:tblW w:w="5000" w:type="pct"/>
+        <w:jc w:val="left"/>
+        <w:tblInd w:w="108" w:type="dxa"/>
+        <w:tblLayout w:type="fixed"/>
+        <w:tblCellMar>
+          <w:top w:w="0" w:type="dxa"/>
+          <w:left w:w="108" w:type="dxa"/>
+          <w:bottom w:w="0" w:type="dxa"/>
+          <w:right w:w="108" w:type="dxa"/>
+        </w:tblCellMar>
+        <w:tblLook w:val="0020" w:noHBand="0" w:noVBand="0" w:firstColumn="0" w:lastRow="0" w:lastColumn="0" w:firstRow="1"/>
+      </w:tblPr>
+      <w:tblGrid>
+        <w:gridCol w:w="3119"/>
+        <w:gridCol w:w="6240"/>
+      </w:tblGrid>
+      <w:tr>
+        <w:trPr>
+          <w:tblHeader w:val="true"/>
+        </w:trPr>
+        <w:tc>
+          <w:tcPr>
+            <w:tcW w:w="3119" w:type="dxa"/>
+            <w:tcBorders>
+              <w:bottom w:val="single" w:sz="6" w:space="0" w:color="000000"/>
+            </w:tcBorders>
+            <w:shd w:color="auto" w:fill="E0E0E0" w:val="clear"/>
+            <w:vAlign w:val="bottom"/>
+          </w:tcPr>
+          <w:p>
+            <w:pPr>
+              <w:pStyle w:val="Compact"/>
+              <w:widowControl/>
+              <w:spacing w:before="36" w:after="36"/>
+              <w:jc w:val="left"/>
+              <w:rPr>
+                <w:rFonts w:ascii="Cambria" w:hAnsi="Cambria" w:eastAsia="Cambria" w:cs=""/>
+                <w:kern w:val="0"/>
+                <w:sz w:val="24"/>
+                <w:szCs w:val="24"/>
+                <w:lang w:val="en-US" w:eastAsia="en-US" w:bidi="ar-SA"/>
+              </w:rPr>
+            </w:pPr>
+            <w:r>
+              <w:rPr>
+                <w:rFonts w:eastAsia="Cambria" w:cs=""/>
+                <w:b/>
+                <w:kern w:val="0"/>
+                <w:sz w:val="20"/>
+                <w:szCs w:val="24"/>
+                <w:lang w:val="en-US" w:eastAsia="en-US" w:bidi="ar-SA"/>
+              </w:rPr>
+              <w:t>Quantity</w:t>
+            </w:r>
+          </w:p>
+        </w:tc>
+        <w:tc>
+          <w:tcPr>
+            <w:tcW w:w="6240" w:type="dxa"/>
+            <w:tcBorders>
+              <w:bottom w:val="single" w:sz="6" w:space="0" w:color="000000"/>
+            </w:tcBorders>
+            <w:shd w:color="auto" w:fill="E0E0E0" w:val="clear"/>
+            <w:vAlign w:val="bottom"/>
+          </w:tcPr>
+          <w:p>
+            <w:pPr>
+              <w:pStyle w:val="Compact"/>
+              <w:widowControl/>
+              <w:spacing w:before="36" w:after="36"/>
+              <w:jc w:val="left"/>
+              <w:rPr>
+                <w:rFonts w:ascii="Cambria" w:hAnsi="Cambria" w:eastAsia="Cambria" w:cs=""/>
+                <w:kern w:val="0"/>
+                <w:sz w:val="24"/>
+                <w:szCs w:val="24"/>
+                <w:lang w:val="en-US" w:eastAsia="en-US" w:bidi="ar-SA"/>
+              </w:rPr>
+            </w:pPr>
+            <w:r>
+              <w:rPr>
+                <w:rFonts w:eastAsia="Cambria" w:cs=""/>
+                <w:b/>
+                <w:kern w:val="0"/>
+                <w:sz w:val="20"/>
+                <w:szCs w:val="24"/>
+                <w:lang w:val="en-US" w:eastAsia="en-US" w:bidi="ar-SA"/>
+              </w:rPr>
+              <w:t>How it is obtained</w:t>
+            </w:r>
+          </w:p>
+        </w:tc>
+      </w:tr>
+      <w:tr>
+        <w:trPr/>
+        <w:tc>
+          <w:tcPr>
+            <w:tcW w:w="3119" w:type="dxa"/>
+            <w:tcBorders/>
+          </w:tcPr>
+          <w:p>
+            <w:pPr>
+              <w:pStyle w:val="Compact"/>
+              <w:widowControl/>
+              <w:spacing w:before="36" w:after="36"/>
+              <w:jc w:val="left"/>
+              <w:rPr>
+                <w:rFonts w:ascii="Cambria" w:hAnsi="Cambria" w:eastAsia="Cambria" w:cs=""/>
+                <w:kern w:val="0"/>
+                <w:sz w:val="24"/>
+                <w:szCs w:val="24"/>
+                <w:lang w:val="en-US" w:eastAsia="en-US" w:bidi="ar-SA"/>
+              </w:rPr>
+            </w:pPr>
+            <w:r>
+              <w:rPr>
+                <w:rFonts w:eastAsia="Cambria" w:cs=""/>
+                <w:kern w:val="0"/>
+                <w:sz w:val="24"/>
+                <w:szCs w:val="24"/>
+                <w:lang w:val="en-US" w:eastAsia="en-US" w:bidi="ar-SA"/>
+              </w:rPr>
+              <w:t>Throughput</w:t>
+            </w:r>
+          </w:p>
+        </w:tc>
+        <w:tc>
+          <w:tcPr>
+            <w:tcW w:w="6240" w:type="dxa"/>
+            <w:tcBorders/>
+          </w:tcPr>
+          <w:p>
+            <w:pPr>
+              <w:pStyle w:val="Compact"/>
+              <w:widowControl/>
+              <w:spacing w:before="36" w:after="36"/>
+              <w:jc w:val="left"/>
+              <w:rPr>
+                <w:rFonts w:ascii="Cambria" w:hAnsi="Cambria" w:eastAsia="Cambria" w:cs=""/>
+                <w:kern w:val="0"/>
+                <w:sz w:val="24"/>
+                <w:szCs w:val="24"/>
+                <w:lang w:val="en-US" w:eastAsia="en-US" w:bidi="ar-SA"/>
+              </w:rPr>
+            </w:pPr>
+            <w:r>
+              <w:rPr>
+                <w:rStyle w:val="VerbatimChar"/>
+                <w:rFonts w:eastAsia="Cambria" w:cs=""/>
+                <w:kern w:val="0"/>
+                <w:szCs w:val="24"/>
+                <w:lang w:val="en-US" w:eastAsia="en-US" w:bidi="ar-SA"/>
+              </w:rPr>
+              <w:t>beats × bytes_per_beat / (TIMER_CYCLES × 10 ns)</w:t>
+            </w:r>
+            <w:r>
+              <w:rPr>
+                <w:rFonts w:eastAsia="Cambria" w:cs=""/>
+                <w:kern w:val="0"/>
+                <w:sz w:val="24"/>
+                <w:szCs w:val="24"/>
+                <w:lang w:val="en-US" w:eastAsia="en-US" w:bidi="ar-SA"/>
+              </w:rPr>
+              <w:t xml:space="preserve"> — the timer bounds the run in </w:t>
+            </w:r>
+            <w:r>
+              <w:rPr>
+                <w:rStyle w:val="VerbatimChar"/>
+                <w:rFonts w:eastAsia="Cambria" w:cs=""/>
+                <w:kern w:val="0"/>
+                <w:szCs w:val="24"/>
+                <w:lang w:val="en-US" w:eastAsia="en-US" w:bidi="ar-SA"/>
+              </w:rPr>
+              <w:t>sys_clk</w:t>
+            </w:r>
+            <w:r>
+              <w:rPr>
+                <w:rFonts w:eastAsia="Cambria" w:cs=""/>
+                <w:kern w:val="0"/>
+                <w:sz w:val="24"/>
+                <w:szCs w:val="24"/>
+                <w:lang w:val="en-US" w:eastAsia="en-US" w:bidi="ar-SA"/>
+              </w:rPr>
+              <w:t xml:space="preserve"> cycles</w:t>
+            </w:r>
+          </w:p>
+        </w:tc>
+      </w:tr>
+      <w:tr>
+        <w:trPr/>
+        <w:tc>
+          <w:tcPr>
+            <w:tcW w:w="3119" w:type="dxa"/>
+            <w:tcBorders/>
+          </w:tcPr>
+          <w:p>
+            <w:pPr>
+              <w:pStyle w:val="Compact"/>
+              <w:widowControl/>
+              <w:spacing w:before="36" w:after="36"/>
+              <w:jc w:val="left"/>
+              <w:rPr>
+                <w:rFonts w:ascii="Cambria" w:hAnsi="Cambria" w:eastAsia="Cambria" w:cs=""/>
+                <w:kern w:val="0"/>
+                <w:sz w:val="24"/>
+                <w:szCs w:val="24"/>
+                <w:lang w:val="en-US" w:eastAsia="en-US" w:bidi="ar-SA"/>
+              </w:rPr>
+            </w:pPr>
+            <w:r>
+              <w:rPr>
+                <w:rFonts w:eastAsia="Cambria" w:cs=""/>
+                <w:kern w:val="0"/>
+                <w:sz w:val="24"/>
+                <w:szCs w:val="24"/>
+                <w:lang w:val="en-US" w:eastAsia="en-US" w:bidi="ar-SA"/>
+              </w:rPr>
+              <w:t>Latency histogram</w:t>
+            </w:r>
+          </w:p>
+        </w:tc>
+        <w:tc>
+          <w:tcPr>
+            <w:tcW w:w="6240" w:type="dxa"/>
+            <w:tcBorders/>
+          </w:tcPr>
+          <w:p>
+            <w:pPr>
+              <w:pStyle w:val="Compact"/>
+              <w:widowControl/>
+              <w:spacing w:before="36" w:after="36"/>
+              <w:jc w:val="left"/>
+              <w:rPr>
+                <w:rFonts w:ascii="Cambria" w:hAnsi="Cambria" w:eastAsia="Cambria" w:cs=""/>
+                <w:kern w:val="0"/>
+                <w:sz w:val="24"/>
+                <w:szCs w:val="24"/>
+                <w:lang w:val="en-US" w:eastAsia="en-US" w:bidi="ar-SA"/>
+              </w:rPr>
+            </w:pPr>
+            <w:r>
+              <w:rPr>
+                <w:rStyle w:val="VerbatimChar"/>
+                <w:rFonts w:eastAsia="Cambria" w:cs=""/>
+                <w:kern w:val="0"/>
+                <w:szCs w:val="24"/>
+                <w:lang w:val="en-US" w:eastAsia="en-US" w:bidi="ar-SA"/>
+              </w:rPr>
+              <w:t>OBS_HIST_SEL</w:t>
+            </w:r>
+            <w:r>
+              <w:rPr>
+                <w:rFonts w:eastAsia="Cambria" w:cs=""/>
+                <w:kern w:val="0"/>
+                <w:sz w:val="24"/>
+                <w:szCs w:val="24"/>
+                <w:lang w:val="en-US" w:eastAsia="en-US" w:bidi="ar-SA"/>
+              </w:rPr>
+              <w:t xml:space="preserve"> selects bus (rd/wr) + metric (AR→firstR / AR→RLAST) + bin; </w:t>
+            </w:r>
+            <w:r>
+              <w:rPr>
+                <w:rStyle w:val="VerbatimChar"/>
+                <w:rFonts w:eastAsia="Cambria" w:cs=""/>
+                <w:kern w:val="0"/>
+                <w:szCs w:val="24"/>
+                <w:lang w:val="en-US" w:eastAsia="en-US" w:bidi="ar-SA"/>
+              </w:rPr>
+              <w:t>OBS_HIST_COUNT</w:t>
+            </w:r>
+            <w:r>
+              <w:rPr>
+                <w:rFonts w:eastAsia="Cambria" w:cs=""/>
+                <w:kern w:val="0"/>
+                <w:sz w:val="24"/>
+                <w:szCs w:val="24"/>
+                <w:lang w:val="en-US" w:eastAsia="en-US" w:bidi="ar-SA"/>
+              </w:rPr>
+              <w:t xml:space="preserve"> / </w:t>
+            </w:r>
+            <w:r>
+              <w:rPr>
+                <w:rStyle w:val="VerbatimChar"/>
+                <w:rFonts w:eastAsia="Cambria" w:cs=""/>
+                <w:kern w:val="0"/>
+                <w:szCs w:val="24"/>
+                <w:lang w:val="en-US" w:eastAsia="en-US" w:bidi="ar-SA"/>
+              </w:rPr>
+              <w:t>OBS_HIST_TOTAL</w:t>
+            </w:r>
+            <w:r>
+              <w:rPr>
+                <w:rFonts w:eastAsia="Cambria" w:cs=""/>
+                <w:kern w:val="0"/>
+                <w:sz w:val="24"/>
+                <w:szCs w:val="24"/>
+                <w:lang w:val="en-US" w:eastAsia="en-US" w:bidi="ar-SA"/>
+              </w:rPr>
+              <w:t xml:space="preserve"> read it back. Bin </w:t>
+            </w:r>
+            <w:r>
+              <w:rPr>
+                <w:rFonts w:eastAsia="Cambria" w:cs=""/>
+                <w:i/>
+                <w:iCs/>
+                <w:kern w:val="0"/>
+                <w:sz w:val="24"/>
+                <w:szCs w:val="24"/>
+                <w:lang w:val="en-US" w:eastAsia="en-US" w:bidi="ar-SA"/>
+              </w:rPr>
+              <w:t>b</w:t>
+            </w:r>
+            <w:r>
+              <w:rPr>
+                <w:rFonts w:eastAsia="Cambria" w:cs=""/>
+                <w:kern w:val="0"/>
+                <w:sz w:val="24"/>
+                <w:szCs w:val="24"/>
+                <w:lang w:val="en-US" w:eastAsia="en-US" w:bidi="ar-SA"/>
+              </w:rPr>
+              <w:t xml:space="preserve"> covers [2^b, 2^(b+1)) cycles</w:t>
+            </w:r>
+          </w:p>
+        </w:tc>
+      </w:tr>
+      <w:tr>
+        <w:trPr/>
+        <w:tc>
+          <w:tcPr>
+            <w:tcW w:w="3119" w:type="dxa"/>
+            <w:tcBorders/>
+          </w:tcPr>
+          <w:p>
+            <w:pPr>
+              <w:pStyle w:val="Compact"/>
+              <w:widowControl/>
+              <w:spacing w:before="36" w:after="36"/>
+              <w:jc w:val="left"/>
+              <w:rPr>
+                <w:rFonts w:ascii="Cambria" w:hAnsi="Cambria" w:eastAsia="Cambria" w:cs=""/>
+                <w:kern w:val="0"/>
+                <w:sz w:val="24"/>
+                <w:szCs w:val="24"/>
+                <w:lang w:val="en-US" w:eastAsia="en-US" w:bidi="ar-SA"/>
+              </w:rPr>
+            </w:pPr>
+            <w:r>
+              <w:rPr>
+                <w:rFonts w:eastAsia="Cambria" w:cs=""/>
+                <w:kern w:val="0"/>
+                <w:sz w:val="24"/>
+                <w:szCs w:val="24"/>
+                <w:lang w:val="en-US" w:eastAsia="en-US" w:bidi="ar-SA"/>
+              </w:rPr>
+              <w:t>Data integrity</w:t>
+            </w:r>
+          </w:p>
+        </w:tc>
+        <w:tc>
+          <w:tcPr>
+            <w:tcW w:w="6240" w:type="dxa"/>
+            <w:tcBorders/>
+          </w:tcPr>
+          <w:p>
+            <w:pPr>
+              <w:pStyle w:val="Compact"/>
+              <w:widowControl/>
+              <w:spacing w:before="36" w:after="36"/>
+              <w:jc w:val="left"/>
+              <w:rPr>
+                <w:rFonts w:ascii="Cambria" w:hAnsi="Cambria" w:eastAsia="Cambria" w:cs=""/>
+                <w:kern w:val="0"/>
+                <w:sz w:val="24"/>
+                <w:szCs w:val="24"/>
+                <w:lang w:val="en-US" w:eastAsia="en-US" w:bidi="ar-SA"/>
+              </w:rPr>
+            </w:pPr>
+            <w:r>
+              <w:rPr>
+                <w:rStyle w:val="VerbatimChar"/>
+                <w:rFonts w:eastAsia="Cambria" w:cs=""/>
+                <w:kern w:val="0"/>
+                <w:szCs w:val="24"/>
+                <w:lang w:val="en-US" w:eastAsia="en-US" w:bidi="ar-SA"/>
+              </w:rPr>
+              <w:t>CRC_ACTUAL</w:t>
+            </w:r>
+            <w:r>
+              <w:rPr>
+                <w:rFonts w:eastAsia="Cambria" w:cs=""/>
+                <w:kern w:val="0"/>
+                <w:sz w:val="24"/>
+                <w:szCs w:val="24"/>
+                <w:lang w:val="en-US" w:eastAsia="en-US" w:bidi="ar-SA"/>
+              </w:rPr>
+              <w:t xml:space="preserve"> vs </w:t>
+            </w:r>
+            <w:r>
+              <w:rPr>
+                <w:rStyle w:val="VerbatimChar"/>
+                <w:rFonts w:eastAsia="Cambria" w:cs=""/>
+                <w:kern w:val="0"/>
+                <w:szCs w:val="24"/>
+                <w:lang w:val="en-US" w:eastAsia="en-US" w:bidi="ar-SA"/>
+              </w:rPr>
+              <w:t>CRC_EXPECTED</w:t>
+            </w:r>
+            <w:r>
+              <w:rPr>
+                <w:rFonts w:eastAsia="Cambria" w:cs=""/>
+                <w:kern w:val="0"/>
+                <w:sz w:val="24"/>
+                <w:szCs w:val="24"/>
+                <w:lang w:val="en-US" w:eastAsia="en-US" w:bidi="ar-SA"/>
+              </w:rPr>
+              <w:t xml:space="preserve"> (</w:t>
+            </w:r>
+            <w:r>
+              <w:rPr>
+                <w:rStyle w:val="VerbatimChar"/>
+                <w:rFonts w:eastAsia="Cambria" w:cs=""/>
+                <w:kern w:val="0"/>
+                <w:szCs w:val="24"/>
+                <w:lang w:val="en-US" w:eastAsia="en-US" w:bidi="ar-SA"/>
+              </w:rPr>
+              <w:t>CRC_MATCH</w:t>
+            </w:r>
+            <w:r>
+              <w:rPr>
+                <w:rFonts w:eastAsia="Cambria" w:cs=""/>
+                <w:kern w:val="0"/>
+                <w:sz w:val="24"/>
+                <w:szCs w:val="24"/>
+                <w:lang w:val="en-US" w:eastAsia="en-US" w:bidi="ar-SA"/>
+              </w:rPr>
+              <w:t xml:space="preserve">), plus </w:t>
+            </w:r>
+            <w:r>
+              <w:rPr>
+                <w:rStyle w:val="VerbatimChar"/>
+                <w:rFonts w:eastAsia="Cambria" w:cs=""/>
+                <w:kern w:val="0"/>
+                <w:szCs w:val="24"/>
+                <w:lang w:val="en-US" w:eastAsia="en-US" w:bidi="ar-SA"/>
+              </w:rPr>
+              <w:t>BEATS_MISM</w:t>
+            </w:r>
+          </w:p>
+        </w:tc>
+      </w:tr>
+      <w:tr>
+        <w:trPr/>
+        <w:tc>
+          <w:tcPr>
+            <w:tcW w:w="3119" w:type="dxa"/>
+            <w:tcBorders/>
+          </w:tcPr>
+          <w:p>
+            <w:pPr>
+              <w:pStyle w:val="Compact"/>
+              <w:widowControl/>
+              <w:spacing w:before="36" w:after="36"/>
+              <w:jc w:val="left"/>
+              <w:rPr>
+                <w:rFonts w:ascii="Cambria" w:hAnsi="Cambria" w:eastAsia="Cambria" w:cs=""/>
+                <w:kern w:val="0"/>
+                <w:sz w:val="24"/>
+                <w:szCs w:val="24"/>
+                <w:lang w:val="en-US" w:eastAsia="en-US" w:bidi="ar-SA"/>
+              </w:rPr>
+            </w:pPr>
+            <w:r>
+              <w:rPr>
+                <w:rFonts w:eastAsia="Cambria" w:cs=""/>
+                <w:kern w:val="0"/>
+                <w:sz w:val="24"/>
+                <w:szCs w:val="24"/>
+                <w:lang w:val="en-US" w:eastAsia="en-US" w:bidi="ar-SA"/>
+              </w:rPr>
+              <w:t>Utilization</w:t>
+            </w:r>
+          </w:p>
+        </w:tc>
+        <w:tc>
+          <w:tcPr>
+            <w:tcW w:w="6240" w:type="dxa"/>
+            <w:tcBorders/>
+          </w:tcPr>
+          <w:p>
+            <w:pPr>
+              <w:pStyle w:val="Compact"/>
+              <w:widowControl/>
+              <w:spacing w:before="36" w:after="36"/>
+              <w:jc w:val="left"/>
+              <w:rPr>
+                <w:rFonts w:ascii="Cambria" w:hAnsi="Cambria" w:eastAsia="Cambria" w:cs=""/>
+                <w:kern w:val="0"/>
+                <w:sz w:val="24"/>
+                <w:szCs w:val="24"/>
+                <w:lang w:val="en-US" w:eastAsia="en-US" w:bidi="ar-SA"/>
+              </w:rPr>
+            </w:pPr>
+            <w:r>
+              <w:rPr>
+                <w:rStyle w:val="VerbatimChar"/>
+                <w:rFonts w:eastAsia="Cambria" w:cs=""/>
+                <w:kern w:val="0"/>
+                <w:szCs w:val="24"/>
+                <w:lang w:val="en-US" w:eastAsia="en-US" w:bidi="ar-SA"/>
+              </w:rPr>
+              <w:t>OBS_{RD,WR}_{PROD,BP,STARV,IDLE}</w:t>
+            </w:r>
+            <w:r>
+              <w:rPr>
+                <w:rFonts w:eastAsia="Cambria" w:cs=""/>
+                <w:kern w:val="0"/>
+                <w:sz w:val="24"/>
+                <w:szCs w:val="24"/>
+                <w:lang w:val="en-US" w:eastAsia="en-US" w:bidi="ar-SA"/>
+              </w:rPr>
+              <w:t xml:space="preserve"> bus-meter buckets</w:t>
+            </w:r>
+          </w:p>
+        </w:tc>
+      </w:tr>
+    </w:tbl>
+    <w:p>
+      <w:pPr>
+        <w:pStyle w:val="BodyText"/>
+        <w:rPr/>
+      </w:pPr>
+      <w:r>
+        <w:rPr>
+          <w:b/>
+          <w:bCs/>
+          <w:sz w:val="20"/>
+        </w:rPr>
+        <w:t>A measurement run:</w:t>
+      </w:r>
+      <w:r>
+        <w:rPr>
+          <w:sz w:val="20"/>
+        </w:rPr>
+        <w:t xml:space="preserve"> program the engine config (address pattern, burst length, txn count, LFSR seed), </w:t>
+      </w:r>
+      <w:r>
+        <w:rPr>
+          <w:rStyle w:val="VerbatimChar"/>
+          <w:sz w:val="20"/>
+        </w:rPr>
+        <w:t>clear_stats</w:t>
+      </w:r>
+      <w:r>
+        <w:rPr>
+          <w:sz w:val="20"/>
+        </w:rPr>
+        <w:t xml:space="preserve">, kick with </w:t>
+      </w:r>
+      <w:r>
+        <w:rPr>
+          <w:rStyle w:val="VerbatimChar"/>
+          <w:sz w:val="20"/>
+        </w:rPr>
+        <w:t>CTRL.start_wr</w:t>
+      </w:r>
+      <w:r>
+        <w:rPr>
+          <w:sz w:val="20"/>
+        </w:rPr>
+        <w:t xml:space="preserve"> / </w:t>
+      </w:r>
+      <w:r>
+        <w:rPr>
+          <w:rStyle w:val="VerbatimChar"/>
+          <w:sz w:val="20"/>
+        </w:rPr>
+        <w:t>start_rd</w:t>
+      </w:r>
+      <w:r>
+        <w:rPr>
+          <w:sz w:val="20"/>
+        </w:rPr>
+        <w:t xml:space="preserve">, poll </w:t>
+      </w:r>
+      <w:r>
+        <w:rPr>
+          <w:rStyle w:val="VerbatimChar"/>
+          <w:sz w:val="20"/>
+        </w:rPr>
+        <w:t>STATUS.wr_done</w:t>
+      </w:r>
+      <w:r>
+        <w:rPr>
+          <w:sz w:val="20"/>
+        </w:rPr>
+        <w:t xml:space="preserve"> / </w:t>
+      </w:r>
+      <w:r>
+        <w:rPr>
+          <w:rStyle w:val="VerbatimChar"/>
+          <w:sz w:val="20"/>
+        </w:rPr>
+        <w:t>rd_done</w:t>
+      </w:r>
+      <w:r>
+        <w:rPr>
+          <w:sz w:val="20"/>
+        </w:rPr>
+        <w:t>, then read the timer, CRC, histogram, and meters. The write engine latches the expected CRC as it generates the pattern; the read engine re-reads and computes the actual CRC.</w:t>
+      </w:r>
+      <w:bookmarkEnd w:id="43"/>
+    </w:p>
+    <w:p>
+      <w:pPr>
+        <w:pStyle w:val="Heading2"/>
+        <w:pBdr>
+          <w:bottom w:val="single" w:sz="12" w:space="0" w:color="228B22"/>
+        </w:pBdr>
+        <w:spacing w:before="280" w:after="80"/>
+        <w:rPr/>
+      </w:pPr>
+      <w:bookmarkStart w:id="45" w:name="__RefHeading___Toc5482_4029633280"/>
+      <w:bookmarkEnd w:id="45"/>
+      <w:r>
+        <w:rPr>
+          <w:rStyle w:val="SectionNumber"/>
+          <w:b/>
+          <w:color w:val="228B22"/>
+          <w:sz w:val="28"/>
+        </w:rPr>
+        <w:t>4.3</w:t>
+      </w:r>
+      <w:r>
+        <w:rPr>
+          <w:b/>
+          <w:color w:val="228B22"/>
+          <w:sz w:val="28"/>
+        </w:rPr>
+        <w:tab/>
+        <w:t>Workloads</w:t>
+      </w:r>
+    </w:p>
+    <w:p>
+      <w:pPr>
+        <w:pStyle w:val="TableCaption"/>
+        <w:rPr/>
+      </w:pPr>
+      <w:bookmarkStart w:id="46" w:name="_Tab_8_Characterization_wor"/>
+      <w:r>
+        <w:rPr/>
+        <w:t>Characterization workloads</w:t>
+      </w:r>
+      <w:bookmarkEnd w:id="46"/>
+    </w:p>
+    <w:tbl>
+      <w:tblPr>
+        <w:tblStyle w:val="Table"/>
+        <w:tblW w:w="5000" w:type="pct"/>
+        <w:jc w:val="left"/>
+        <w:tblInd w:w="108" w:type="dxa"/>
+        <w:tblLayout w:type="fixed"/>
+        <w:tblCellMar>
+          <w:top w:w="0" w:type="dxa"/>
+          <w:left w:w="108" w:type="dxa"/>
+          <w:bottom w:w="0" w:type="dxa"/>
+          <w:right w:w="108" w:type="dxa"/>
+        </w:tblCellMar>
+        <w:tblLook w:val="0020" w:noHBand="0" w:noVBand="0" w:firstColumn="0" w:lastRow="0" w:lastColumn="0" w:firstRow="1"/>
+      </w:tblPr>
+      <w:tblGrid>
+        <w:gridCol w:w="4011"/>
+        <w:gridCol w:w="5348"/>
+      </w:tblGrid>
+      <w:tr>
+        <w:trPr>
+          <w:tblHeader w:val="true"/>
+        </w:trPr>
+        <w:tc>
+          <w:tcPr>
+            <w:tcW w:w="4011" w:type="dxa"/>
+            <w:tcBorders>
+              <w:bottom w:val="single" w:sz="6" w:space="0" w:color="000000"/>
+            </w:tcBorders>
+            <w:shd w:color="auto" w:fill="E0E0E0" w:val="clear"/>
+            <w:vAlign w:val="bottom"/>
+          </w:tcPr>
+          <w:p>
+            <w:pPr>
+              <w:pStyle w:val="Compact"/>
+              <w:widowControl/>
+              <w:spacing w:before="36" w:after="36"/>
+              <w:jc w:val="left"/>
+              <w:rPr>
+                <w:rFonts w:ascii="Cambria" w:hAnsi="Cambria" w:eastAsia="Cambria" w:cs=""/>
+                <w:kern w:val="0"/>
+                <w:sz w:val="24"/>
+                <w:szCs w:val="24"/>
+                <w:lang w:val="en-US" w:eastAsia="en-US" w:bidi="ar-SA"/>
+              </w:rPr>
+            </w:pPr>
+            <w:r>
+              <w:rPr>
+                <w:rFonts w:eastAsia="Cambria" w:cs=""/>
+                <w:b/>
+                <w:kern w:val="0"/>
+                <w:sz w:val="20"/>
+                <w:szCs w:val="24"/>
+                <w:lang w:val="en-US" w:eastAsia="en-US" w:bidi="ar-SA"/>
+              </w:rPr>
+              <w:t>Axis</w:t>
+            </w:r>
+          </w:p>
+        </w:tc>
+        <w:tc>
+          <w:tcPr>
+            <w:tcW w:w="5348" w:type="dxa"/>
+            <w:tcBorders>
+              <w:bottom w:val="single" w:sz="6" w:space="0" w:color="000000"/>
+            </w:tcBorders>
+            <w:shd w:color="auto" w:fill="E0E0E0" w:val="clear"/>
+            <w:vAlign w:val="bottom"/>
+          </w:tcPr>
+          <w:p>
+            <w:pPr>
+              <w:pStyle w:val="Compact"/>
+              <w:widowControl/>
+              <w:spacing w:before="36" w:after="36"/>
+              <w:jc w:val="left"/>
+              <w:rPr>
+                <w:rFonts w:ascii="Cambria" w:hAnsi="Cambria" w:eastAsia="Cambria" w:cs=""/>
+                <w:kern w:val="0"/>
+                <w:sz w:val="24"/>
+                <w:szCs w:val="24"/>
+                <w:lang w:val="en-US" w:eastAsia="en-US" w:bidi="ar-SA"/>
+              </w:rPr>
+            </w:pPr>
+            <w:r>
+              <w:rPr>
+                <w:rFonts w:eastAsia="Cambria" w:cs=""/>
+                <w:b/>
+                <w:kern w:val="0"/>
+                <w:sz w:val="20"/>
+                <w:szCs w:val="24"/>
+                <w:lang w:val="en-US" w:eastAsia="en-US" w:bidi="ar-SA"/>
+              </w:rPr>
+              <w:t>Values</w:t>
+            </w:r>
+          </w:p>
+        </w:tc>
+      </w:tr>
+      <w:tr>
+        <w:trPr/>
+        <w:tc>
+          <w:tcPr>
+            <w:tcW w:w="4011" w:type="dxa"/>
+            <w:tcBorders/>
+          </w:tcPr>
+          <w:p>
+            <w:pPr>
+              <w:pStyle w:val="Compact"/>
+              <w:widowControl/>
+              <w:spacing w:before="36" w:after="36"/>
+              <w:jc w:val="left"/>
+              <w:rPr>
+                <w:rFonts w:ascii="Cambria" w:hAnsi="Cambria" w:eastAsia="Cambria" w:cs=""/>
+                <w:kern w:val="0"/>
+                <w:sz w:val="24"/>
+                <w:szCs w:val="24"/>
+                <w:lang w:val="en-US" w:eastAsia="en-US" w:bidi="ar-SA"/>
+              </w:rPr>
+            </w:pPr>
+            <w:r>
+              <w:rPr>
+                <w:rFonts w:eastAsia="Cambria" w:cs=""/>
+                <w:kern w:val="0"/>
+                <w:sz w:val="24"/>
+                <w:szCs w:val="24"/>
+                <w:lang w:val="en-US" w:eastAsia="en-US" w:bidi="ar-SA"/>
+              </w:rPr>
+              <w:t>Access pattern</w:t>
+            </w:r>
+          </w:p>
+        </w:tc>
+        <w:tc>
+          <w:tcPr>
+            <w:tcW w:w="5348" w:type="dxa"/>
+            <w:tcBorders/>
+          </w:tcPr>
+          <w:p>
+            <w:pPr>
+              <w:pStyle w:val="Compact"/>
+              <w:widowControl/>
+              <w:spacing w:before="36" w:after="36"/>
+              <w:jc w:val="left"/>
+              <w:rPr>
+                <w:rFonts w:ascii="Cambria" w:hAnsi="Cambria" w:eastAsia="Cambria" w:cs=""/>
+                <w:kern w:val="0"/>
+                <w:sz w:val="24"/>
+                <w:szCs w:val="24"/>
+                <w:lang w:val="en-US" w:eastAsia="en-US" w:bidi="ar-SA"/>
+              </w:rPr>
+            </w:pPr>
+            <w:r>
+              <w:rPr>
+                <w:rStyle w:val="VerbatimChar"/>
+                <w:rFonts w:eastAsia="Cambria" w:cs=""/>
+                <w:kern w:val="0"/>
+                <w:szCs w:val="24"/>
+                <w:lang w:val="en-US" w:eastAsia="en-US" w:bidi="ar-SA"/>
+              </w:rPr>
+              <w:t>incremental</w:t>
+            </w:r>
+            <w:r>
+              <w:rPr>
+                <w:rFonts w:eastAsia="Cambria" w:cs=""/>
+                <w:kern w:val="0"/>
+                <w:sz w:val="24"/>
+                <w:szCs w:val="24"/>
+                <w:lang w:val="en-US" w:eastAsia="en-US" w:bidi="ar-SA"/>
+              </w:rPr>
+              <w:t xml:space="preserve">, </w:t>
+            </w:r>
+            <w:r>
+              <w:rPr>
+                <w:rStyle w:val="VerbatimChar"/>
+                <w:rFonts w:eastAsia="Cambria" w:cs=""/>
+                <w:kern w:val="0"/>
+                <w:szCs w:val="24"/>
+                <w:lang w:val="en-US" w:eastAsia="en-US" w:bidi="ar-SA"/>
+              </w:rPr>
+              <w:t>row_major</w:t>
+            </w:r>
+            <w:r>
+              <w:rPr>
+                <w:rFonts w:eastAsia="Cambria" w:cs=""/>
+                <w:kern w:val="0"/>
+                <w:sz w:val="24"/>
+                <w:szCs w:val="24"/>
+                <w:lang w:val="en-US" w:eastAsia="en-US" w:bidi="ar-SA"/>
+              </w:rPr>
+              <w:t xml:space="preserve">, </w:t>
+            </w:r>
+            <w:r>
+              <w:rPr>
+                <w:rStyle w:val="VerbatimChar"/>
+                <w:rFonts w:eastAsia="Cambria" w:cs=""/>
+                <w:kern w:val="0"/>
+                <w:szCs w:val="24"/>
+                <w:lang w:val="en-US" w:eastAsia="en-US" w:bidi="ar-SA"/>
+              </w:rPr>
+              <w:t>col_major</w:t>
+            </w:r>
+            <w:r>
+              <w:rPr>
+                <w:rFonts w:eastAsia="Cambria" w:cs=""/>
+                <w:kern w:val="0"/>
+                <w:sz w:val="24"/>
+                <w:szCs w:val="24"/>
+                <w:lang w:val="en-US" w:eastAsia="en-US" w:bidi="ar-SA"/>
+              </w:rPr>
+              <w:t xml:space="preserve">, </w:t>
+            </w:r>
+            <w:r>
+              <w:rPr>
+                <w:rStyle w:val="VerbatimChar"/>
+                <w:rFonts w:eastAsia="Cambria" w:cs=""/>
+                <w:kern w:val="0"/>
+                <w:szCs w:val="24"/>
+                <w:lang w:val="en-US" w:eastAsia="en-US" w:bidi="ar-SA"/>
+              </w:rPr>
+              <w:t>col_major_interleaved</w:t>
+            </w:r>
+          </w:p>
+        </w:tc>
+      </w:tr>
+      <w:tr>
+        <w:trPr/>
+        <w:tc>
+          <w:tcPr>
+            <w:tcW w:w="4011" w:type="dxa"/>
+            <w:tcBorders/>
+          </w:tcPr>
+          <w:p>
+            <w:pPr>
+              <w:pStyle w:val="Compact"/>
+              <w:widowControl/>
+              <w:spacing w:before="36" w:after="36"/>
+              <w:jc w:val="left"/>
+              <w:rPr>
+                <w:rFonts w:ascii="Cambria" w:hAnsi="Cambria" w:eastAsia="Cambria" w:cs=""/>
+                <w:kern w:val="0"/>
+                <w:sz w:val="24"/>
+                <w:szCs w:val="24"/>
+                <w:lang w:val="en-US" w:eastAsia="en-US" w:bidi="ar-SA"/>
+              </w:rPr>
+            </w:pPr>
+            <w:r>
+              <w:rPr>
+                <w:rFonts w:eastAsia="Cambria" w:cs=""/>
+                <w:kern w:val="0"/>
+                <w:sz w:val="24"/>
+                <w:szCs w:val="24"/>
+                <w:lang w:val="en-US" w:eastAsia="en-US" w:bidi="ar-SA"/>
+              </w:rPr>
+              <w:t>Controller preset</w:t>
+            </w:r>
+          </w:p>
+        </w:tc>
+        <w:tc>
+          <w:tcPr>
+            <w:tcW w:w="5348" w:type="dxa"/>
+            <w:tcBorders/>
+          </w:tcPr>
+          <w:p>
+            <w:pPr>
+              <w:pStyle w:val="Compact"/>
+              <w:widowControl/>
+              <w:spacing w:before="36" w:after="36"/>
+              <w:jc w:val="left"/>
+              <w:rPr>
+                <w:rFonts w:ascii="Cambria" w:hAnsi="Cambria" w:eastAsia="Cambria" w:cs=""/>
+                <w:kern w:val="0"/>
+                <w:sz w:val="24"/>
+                <w:szCs w:val="24"/>
+                <w:lang w:val="en-US" w:eastAsia="en-US" w:bidi="ar-SA"/>
+              </w:rPr>
+            </w:pPr>
+            <w:r>
+              <w:rPr>
+                <w:rStyle w:val="VerbatimChar"/>
+                <w:rFonts w:eastAsia="Cambria" w:cs=""/>
+                <w:kern w:val="0"/>
+                <w:szCs w:val="24"/>
+                <w:lang w:val="en-US" w:eastAsia="en-US" w:bidi="ar-SA"/>
+              </w:rPr>
+              <w:t>baseline</w:t>
+            </w:r>
+            <w:r>
+              <w:rPr>
+                <w:rFonts w:eastAsia="Cambria" w:cs=""/>
+                <w:kern w:val="0"/>
+                <w:sz w:val="24"/>
+                <w:szCs w:val="24"/>
+                <w:lang w:val="en-US" w:eastAsia="en-US" w:bidi="ar-SA"/>
+              </w:rPr>
+              <w:t xml:space="preserve">, </w:t>
+            </w:r>
+            <w:r>
+              <w:rPr>
+                <w:rStyle w:val="VerbatimChar"/>
+                <w:rFonts w:eastAsia="Cambria" w:cs=""/>
+                <w:kern w:val="0"/>
+                <w:szCs w:val="24"/>
+                <w:lang w:val="en-US" w:eastAsia="en-US" w:bidi="ar-SA"/>
+              </w:rPr>
+              <w:t>bank_interleave</w:t>
+            </w:r>
+            <w:r>
+              <w:rPr>
+                <w:rFonts w:eastAsia="Cambria" w:cs=""/>
+                <w:kern w:val="0"/>
+                <w:sz w:val="24"/>
+                <w:szCs w:val="24"/>
+                <w:lang w:val="en-US" w:eastAsia="en-US" w:bidi="ar-SA"/>
+              </w:rPr>
+              <w:t xml:space="preserve">, </w:t>
+            </w:r>
+            <w:r>
+              <w:rPr>
+                <w:rStyle w:val="VerbatimChar"/>
+                <w:rFonts w:eastAsia="Cambria" w:cs=""/>
+                <w:kern w:val="0"/>
+                <w:szCs w:val="24"/>
+                <w:lang w:val="en-US" w:eastAsia="en-US" w:bidi="ar-SA"/>
+              </w:rPr>
+              <w:t>open_page</w:t>
+            </w:r>
+            <w:r>
+              <w:rPr>
+                <w:rFonts w:eastAsia="Cambria" w:cs=""/>
+                <w:kern w:val="0"/>
+                <w:sz w:val="24"/>
+                <w:szCs w:val="24"/>
+                <w:lang w:val="en-US" w:eastAsia="en-US" w:bidi="ar-SA"/>
+              </w:rPr>
+              <w:t xml:space="preserve">, </w:t>
+            </w:r>
+            <w:r>
+              <w:rPr>
+                <w:rStyle w:val="VerbatimChar"/>
+                <w:rFonts w:eastAsia="Cambria" w:cs=""/>
+                <w:kern w:val="0"/>
+                <w:szCs w:val="24"/>
+                <w:lang w:val="en-US" w:eastAsia="en-US" w:bidi="ar-SA"/>
+              </w:rPr>
+              <w:t>inorder</w:t>
+            </w:r>
+            <w:r>
+              <w:rPr>
+                <w:rFonts w:eastAsia="Cambria" w:cs=""/>
+                <w:kern w:val="0"/>
+                <w:sz w:val="24"/>
+                <w:szCs w:val="24"/>
+                <w:lang w:val="en-US" w:eastAsia="en-US" w:bidi="ar-SA"/>
+              </w:rPr>
+              <w:t xml:space="preserve">, </w:t>
+            </w:r>
+            <w:r>
+              <w:rPr>
+                <w:rStyle w:val="VerbatimChar"/>
+                <w:rFonts w:eastAsia="Cambria" w:cs=""/>
+                <w:kern w:val="0"/>
+                <w:szCs w:val="24"/>
+                <w:lang w:val="en-US" w:eastAsia="en-US" w:bidi="ar-SA"/>
+              </w:rPr>
+              <w:t>reorder</w:t>
+            </w:r>
+            <w:r>
+              <w:rPr>
+                <w:rFonts w:eastAsia="Cambria" w:cs=""/>
+                <w:kern w:val="0"/>
+                <w:sz w:val="24"/>
+                <w:szCs w:val="24"/>
+                <w:lang w:val="en-US" w:eastAsia="en-US" w:bidi="ar-SA"/>
+              </w:rPr>
+              <w:t>, … (over the pumice APB slave)</w:t>
+            </w:r>
+          </w:p>
+        </w:tc>
+      </w:tr>
+      <w:tr>
+        <w:trPr/>
+        <w:tc>
+          <w:tcPr>
+            <w:tcW w:w="4011" w:type="dxa"/>
+            <w:tcBorders/>
+          </w:tcPr>
+          <w:p>
+            <w:pPr>
+              <w:pStyle w:val="Compact"/>
+              <w:widowControl/>
+              <w:spacing w:before="36" w:after="36"/>
+              <w:jc w:val="left"/>
+              <w:rPr>
+                <w:rFonts w:ascii="Cambria" w:hAnsi="Cambria" w:eastAsia="Cambria" w:cs=""/>
+                <w:kern w:val="0"/>
+                <w:sz w:val="24"/>
+                <w:szCs w:val="24"/>
+                <w:lang w:val="en-US" w:eastAsia="en-US" w:bidi="ar-SA"/>
+              </w:rPr>
+            </w:pPr>
+            <w:r>
+              <w:rPr>
+                <w:rFonts w:eastAsia="Cambria" w:cs=""/>
+                <w:kern w:val="0"/>
+                <w:sz w:val="24"/>
+                <w:szCs w:val="24"/>
+                <w:lang w:val="en-US" w:eastAsia="en-US" w:bidi="ar-SA"/>
+              </w:rPr>
+              <w:t>Burst / count / stride</w:t>
+            </w:r>
+          </w:p>
+        </w:tc>
+        <w:tc>
+          <w:tcPr>
+            <w:tcW w:w="5348" w:type="dxa"/>
+            <w:tcBorders/>
+          </w:tcPr>
+          <w:p>
+            <w:pPr>
+              <w:pStyle w:val="Compact"/>
+              <w:widowControl/>
+              <w:spacing w:before="36" w:after="36"/>
+              <w:jc w:val="left"/>
+              <w:rPr>
+                <w:rFonts w:ascii="Cambria" w:hAnsi="Cambria" w:eastAsia="Cambria" w:cs=""/>
+                <w:kern w:val="0"/>
+                <w:sz w:val="24"/>
+                <w:szCs w:val="24"/>
+                <w:lang w:val="en-US" w:eastAsia="en-US" w:bidi="ar-SA"/>
+              </w:rPr>
+            </w:pPr>
+            <w:r>
+              <w:rPr>
+                <w:rFonts w:eastAsia="Cambria" w:cs=""/>
+                <w:kern w:val="0"/>
+                <w:sz w:val="24"/>
+                <w:szCs w:val="24"/>
+                <w:lang w:val="en-US" w:eastAsia="en-US" w:bidi="ar-SA"/>
+              </w:rPr>
+              <w:t xml:space="preserve">swept per </w:t>
+            </w:r>
+            <w:r>
+              <w:rPr>
+                <w:rStyle w:val="VerbatimChar"/>
+                <w:rFonts w:eastAsia="Cambria" w:cs=""/>
+                <w:kern w:val="0"/>
+                <w:szCs w:val="24"/>
+                <w:lang w:val="en-US" w:eastAsia="en-US" w:bidi="ar-SA"/>
+              </w:rPr>
+              <w:t>--char-profile</w:t>
+            </w:r>
+            <w:r>
+              <w:rPr>
+                <w:rFonts w:eastAsia="Cambria" w:cs=""/>
+                <w:kern w:val="0"/>
+                <w:sz w:val="24"/>
+                <w:szCs w:val="24"/>
+                <w:lang w:val="en-US" w:eastAsia="en-US" w:bidi="ar-SA"/>
+              </w:rPr>
+              <w:t xml:space="preserve"> (smoke / matrix / full)</w:t>
+            </w:r>
+            <w:bookmarkStart w:id="47" w:name="workloads"/>
+            <w:bookmarkEnd w:id="47"/>
+          </w:p>
+        </w:tc>
+      </w:tr>
+    </w:tbl>
+    <w:p>
+      <w:pPr>
+        <w:pStyle w:val="Heading2"/>
+        <w:pBdr>
+          <w:bottom w:val="single" w:sz="12" w:space="0" w:color="228B22"/>
+        </w:pBdr>
+        <w:spacing w:before="280" w:after="80"/>
+        <w:rPr/>
+      </w:pPr>
+      <w:bookmarkStart w:id="48" w:name="__RefHeading___Toc5484_4029633280"/>
+      <w:bookmarkEnd w:id="48"/>
+      <w:r>
+        <w:rPr>
+          <w:rStyle w:val="SectionNumber"/>
+          <w:b/>
+          <w:color w:val="228B22"/>
+          <w:sz w:val="28"/>
+        </w:rPr>
+        <w:t>4.4</w:t>
+      </w:r>
+      <w:r>
+        <w:rPr>
+          <w:b/>
+          <w:color w:val="228B22"/>
+          <w:sz w:val="28"/>
+        </w:rPr>
+        <w:tab/>
+        <w:t>The oracle</w:t>
+      </w:r>
+    </w:p>
+    <w:p>
+      <w:pPr>
+        <w:pStyle w:val="FirstParagraph"/>
+        <w:rPr/>
+      </w:pPr>
+      <w:r>
+        <w:rPr>
+          <w:sz w:val="20"/>
+        </w:rPr>
+        <w:t xml:space="preserve">Integrity is judged against a deterministic </w:t>
+      </w:r>
+      <w:r>
+        <w:rPr>
+          <w:b/>
+          <w:bCs/>
+          <w:sz w:val="20"/>
+        </w:rPr>
+        <w:t>LFSR pattern + CRC-32</w:t>
+      </w:r>
+      <w:r>
+        <w:rPr>
+          <w:sz w:val="20"/>
+        </w:rPr>
+        <w:t xml:space="preserve">: the write engine’s </w:t>
+      </w:r>
+      <w:r>
+        <w:rPr>
+          <w:rStyle w:val="VerbatimChar"/>
+          <w:sz w:val="20"/>
+        </w:rPr>
+        <w:t>CRC_EXPECTED</w:t>
+      </w:r>
+      <w:r>
+        <w:rPr>
+          <w:sz w:val="20"/>
+        </w:rPr>
+        <w:t xml:space="preserve"> must equal the read engine’s </w:t>
+      </w:r>
+      <w:r>
+        <w:rPr>
+          <w:rStyle w:val="VerbatimChar"/>
+          <w:sz w:val="20"/>
+        </w:rPr>
+        <w:t>CRC_ACTUAL</w:t>
+      </w:r>
+      <w:r>
+        <w:rPr>
+          <w:sz w:val="20"/>
+        </w:rPr>
+        <w:t xml:space="preserve"> with </w:t>
+      </w:r>
+      <w:r>
+        <w:rPr>
+          <w:rStyle w:val="VerbatimChar"/>
+          <w:sz w:val="20"/>
+        </w:rPr>
+        <w:t>BEATS_MISM = 0</w:t>
+      </w:r>
+      <w:r>
+        <w:rPr>
+          <w:sz w:val="20"/>
+        </w:rPr>
+        <w:t>. The same golden logic runs in sim (Chapter 6).</w:t>
+      </w:r>
+    </w:p>
+    <w:p>
+      <w:pPr>
+        <w:pStyle w:val="Heading2"/>
+        <w:pBdr>
+          <w:bottom w:val="single" w:sz="12" w:space="0" w:color="228B22"/>
+        </w:pBdr>
+        <w:spacing w:before="280" w:after="80"/>
+        <w:rPr/>
+      </w:pPr>
+      <w:bookmarkStart w:id="49" w:name="__RefHeading___Toc5486_4029633280"/>
+      <w:bookmarkStart w:id="50" w:name="measurement-pitfalls"/>
+      <w:bookmarkEnd w:id="49"/>
+      <w:r>
+        <w:rPr>
+          <w:rStyle w:val="SectionNumber"/>
+          <w:b/>
+          <w:color w:val="228B22"/>
+          <w:sz w:val="28"/>
+        </w:rPr>
+        <w:t>4.5</w:t>
+      </w:r>
+      <w:r>
+        <w:rPr>
+          <w:b/>
+          <w:color w:val="228B22"/>
+          <w:sz w:val="28"/>
+        </w:rPr>
+        <w:tab/>
+        <w:t>Measurement pitfalls</w:t>
+      </w:r>
+    </w:p>
+    <w:p>
+      <w:pPr>
+        <w:pStyle w:val="Compact"/>
+        <w:numPr>
+          <w:ilvl w:val="0"/>
+          <w:numId w:val="5"/>
+        </w:numPr>
+        <w:rPr/>
+      </w:pPr>
+      <w:r>
+        <w:rPr>
+          <w:rStyle w:val="VerbatimChar"/>
+        </w:rPr>
+        <w:t>STATUS.any_error</w:t>
+      </w:r>
+      <w:r>
+        <w:rPr/>
+        <w:t xml:space="preserve"> is </w:t>
+      </w:r>
+      <w:r>
+        <w:rPr>
+          <w:b/>
+          <w:bCs/>
+        </w:rPr>
+        <w:t>sticky</w:t>
+      </w:r>
+      <w:r>
+        <w:rPr/>
+        <w:t xml:space="preserve"> — clear it with </w:t>
+      </w:r>
+      <w:r>
+        <w:rPr>
+          <w:rStyle w:val="VerbatimChar"/>
+        </w:rPr>
+        <w:t>clear_stats</w:t>
+      </w:r>
+      <w:r>
+        <w:rPr/>
+        <w:t xml:space="preserve"> between phases or every later run looks wedged.</w:t>
+      </w:r>
+    </w:p>
+    <w:p>
+      <w:pPr>
+        <w:pStyle w:val="Compact"/>
+        <w:numPr>
+          <w:ilvl w:val="0"/>
+          <w:numId w:val="6"/>
+        </w:numPr>
+        <w:rPr/>
+      </w:pPr>
+      <w:r>
+        <w:rPr/>
+        <w:t xml:space="preserve">Keep board runs </w:t>
+      </w:r>
+      <w:r>
+        <w:rPr>
+          <w:rStyle w:val="VerbatimChar"/>
+        </w:rPr>
+        <w:t>txn ≤ 1024</w:t>
+      </w:r>
+      <w:r>
+        <w:rPr/>
+        <w:t xml:space="preserve"> (read-engine CAM ceiling) for clean completion; the </w:t>
+      </w:r>
+      <w:r>
+        <w:rPr>
+          <w:i/>
+          <w:iCs/>
+        </w:rPr>
+        <w:t>rate</w:t>
+      </w:r>
+      <w:r>
+        <w:rPr/>
+        <w:t xml:space="preserve"> stays valid at scale.</w:t>
+      </w:r>
+    </w:p>
+    <w:p>
+      <w:pPr>
+        <w:pStyle w:val="Compact"/>
+        <w:numPr>
+          <w:ilvl w:val="0"/>
+          <w:numId w:val="7"/>
+        </w:numPr>
+        <w:rPr/>
+      </w:pPr>
+      <w:r>
+        <w:rPr>
+          <w:rStyle w:val="VerbatimChar"/>
+        </w:rPr>
+        <w:t>col_major</w:t>
+      </w:r>
+      <w:r>
+        <w:rPr/>
+        <w:t xml:space="preserve"> stride × large txn can alias past the 128 MB device — bound it.</w:t>
+      </w:r>
+    </w:p>
+    <w:p>
+      <w:pPr>
+        <w:pStyle w:val="Compact"/>
+        <w:numPr>
+          <w:ilvl w:val="0"/>
+          <w:numId w:val="8"/>
+        </w:numPr>
+        <w:rPr/>
+      </w:pPr>
+      <w:r>
+        <w:rPr/>
+        <w:t xml:space="preserve">The sim must be built at the board’s exact </w:t>
+      </w:r>
+      <w:r>
+        <w:rPr>
+          <w:rStyle w:val="VerbatimChar"/>
+        </w:rPr>
+        <w:t>DFI_RATE</w:t>
+      </w:r>
+      <w:r>
+        <w:rPr/>
+        <w:t xml:space="preserve"> / GEAR or it passes while the board fails (Chapter 6).</w:t>
+      </w:r>
+      <w:bookmarkEnd w:id="39"/>
+      <w:bookmarkEnd w:id="50"/>
+    </w:p>
+    <w:p>
+      <w:pPr>
+        <w:pStyle w:val="Heading1"/>
+        <w:shd w:val="clear" w:color="auto" w:fill="404040"/>
+        <w:spacing w:before="360" w:after="120"/>
+        <w:rPr/>
+      </w:pPr>
+      <w:bookmarkStart w:id="51" w:name="__RefHeading___Toc5488_4029633280"/>
+      <w:bookmarkStart w:id="52" w:name="build-and-run"/>
+      <w:bookmarkEnd w:id="51"/>
+      <w:r>
+        <w:rPr>
+          <w:rStyle w:val="SectionNumber"/>
+          <w:b/>
+          <w:color w:val="FFFFFF"/>
+          <w:sz w:val="32"/>
+        </w:rPr>
+        <w:t>5</w:t>
+      </w:r>
+      <w:r>
+        <w:rPr>
+          <w:b/>
+          <w:color w:val="FFFFFF"/>
+          <w:sz w:val="32"/>
+        </w:rPr>
+        <w:tab/>
+        <w:t>Build and Run</w:t>
+      </w:r>
+    </w:p>
+    <w:p>
+      <w:pPr>
+        <w:pStyle w:val="FirstParagraph"/>
+        <w:rPr/>
+      </w:pPr>
+      <w:r>
+        <w:rPr>
+          <w:sz w:val="20"/>
+        </w:rPr>
+        <w:t xml:space="preserve">All commands assume the Python environment is sourced (sets </w:t>
+      </w:r>
+      <w:r>
+        <w:rPr>
+          <w:rStyle w:val="VerbatimChar"/>
+          <w:sz w:val="20"/>
+        </w:rPr>
+        <w:t>REPO_ROOT</w:t>
+      </w:r>
+      <w:r>
+        <w:rPr>
+          <w:sz w:val="20"/>
+        </w:rPr>
+        <w:t xml:space="preserve">, </w:t>
+      </w:r>
+      <w:r>
+        <w:rPr>
+          <w:rStyle w:val="VerbatimChar"/>
+          <w:sz w:val="20"/>
+        </w:rPr>
+        <w:t>SIM=verilator</w:t>
+      </w:r>
+      <w:r>
+        <w:rPr>
+          <w:sz w:val="20"/>
+        </w:rPr>
+        <w:t xml:space="preserve">, </w:t>
+      </w:r>
+      <w:r>
+        <w:rPr>
+          <w:rStyle w:val="VerbatimChar"/>
+          <w:sz w:val="20"/>
+        </w:rPr>
+        <w:t>PATH</w:t>
+      </w:r>
+      <w:r>
+        <w:rPr>
+          <w:sz w:val="20"/>
+        </w:rPr>
+        <w:t xml:space="preserve">, </w:t>
+      </w:r>
+      <w:r>
+        <w:rPr>
+          <w:rStyle w:val="VerbatimChar"/>
+          <w:sz w:val="20"/>
+        </w:rPr>
+        <w:t>PYTHONPATH</w:t>
+      </w:r>
+      <w:r>
+        <w:rPr>
+          <w:sz w:val="20"/>
+        </w:rPr>
+        <w:t>):</w:t>
+      </w:r>
+    </w:p>
+    <w:p>
+      <w:pPr>
+        <w:pStyle w:val="SourceCode"/>
+        <w:rPr/>
+      </w:pPr>
+      <w:r>
+        <w:rPr>
+          <w:rStyle w:val="BuiltInTok"/>
+        </w:rPr>
+        <w:t>cd</w:t>
+      </w:r>
+      <w:r>
+        <w:rPr>
+          <w:rStyle w:val="NormalTok"/>
+        </w:rPr>
+        <w:t xml:space="preserve"> /path/to/RTLDesignSherpa </w:t>
+      </w:r>
+      <w:r>
+        <w:rPr>
+          <w:rStyle w:val="KeywordTok"/>
+        </w:rPr>
+        <w:t>&amp;&amp;</w:t>
+      </w:r>
+      <w:r>
+        <w:rPr>
+          <w:rStyle w:val="NormalTok"/>
+        </w:rPr>
+        <w:t xml:space="preserve"> </w:t>
+      </w:r>
+      <w:r>
+        <w:rPr>
+          <w:rStyle w:val="BuiltInTok"/>
+        </w:rPr>
+        <w:t>source</w:t>
+      </w:r>
+      <w:r>
+        <w:rPr>
+          <w:rStyle w:val="NormalTok"/>
+        </w:rPr>
+        <w:t xml:space="preserve"> env_python</w:t>
+      </w:r>
+      <w:r>
+        <w:rPr/>
+        <w:br/>
+      </w:r>
+      <w:r>
+        <w:rPr>
+          <w:rStyle w:val="BuiltInTok"/>
+        </w:rPr>
+        <w:t>cd</w:t>
+      </w:r>
+      <w:r>
+        <w:rPr>
+          <w:rStyle w:val="NormalTok"/>
+        </w:rPr>
+        <w:t xml:space="preserve"> projects/NexysA7/ddr2-characterization/flows-ours-uart</w:t>
+      </w:r>
+    </w:p>
+    <w:p>
+      <w:pPr>
+        <w:pStyle w:val="Heading2"/>
+        <w:pBdr>
+          <w:bottom w:val="single" w:sz="12" w:space="0" w:color="228B22"/>
+        </w:pBdr>
+        <w:spacing w:before="280" w:after="80"/>
+        <w:rPr/>
+      </w:pPr>
+      <w:bookmarkStart w:id="53" w:name="__RefHeading___Toc5490_4029633280"/>
+      <w:bookmarkStart w:id="54" w:name="flows-ours-uart-make-targets"/>
+      <w:bookmarkEnd w:id="53"/>
+      <w:r>
+        <w:rPr>
+          <w:rStyle w:val="SectionNumber"/>
+          <w:b/>
+          <w:color w:val="228B22"/>
+          <w:sz w:val="28"/>
+        </w:rPr>
+        <w:t>5.1</w:t>
+      </w:r>
+      <w:r>
+        <w:rPr>
+          <w:b/>
+          <w:color w:val="228B22"/>
+          <w:sz w:val="28"/>
+        </w:rPr>
+        <w:tab/>
+      </w:r>
+      <w:r>
+        <w:rPr>
+          <w:rStyle w:val="VerbatimChar"/>
+          <w:b/>
+          <w:color w:val="228B22"/>
+          <w:sz w:val="28"/>
+        </w:rPr>
+        <w:t>flows-ours-uart</w:t>
+      </w:r>
+      <w:r>
+        <w:rPr>
+          <w:b/>
+          <w:color w:val="228B22"/>
+          <w:sz w:val="28"/>
+        </w:rPr>
+        <w:t xml:space="preserve"> make targets</w:t>
+      </w:r>
+    </w:p>
+    <w:p>
+      <w:pPr>
+        <w:pStyle w:val="FirstParagraph"/>
+        <w:rPr/>
+      </w:pPr>
+      <w:r>
+        <w:rPr>
+          <w:rStyle w:val="VerbatimChar"/>
+          <w:sz w:val="20"/>
+        </w:rPr>
+        <w:t>UART ?= /dev/ttyUSB1</w:t>
+      </w:r>
+      <w:r>
+        <w:rPr>
+          <w:sz w:val="20"/>
+        </w:rPr>
+        <w:t xml:space="preserve">, </w:t>
+      </w:r>
+      <w:r>
+        <w:rPr>
+          <w:rStyle w:val="VerbatimChar"/>
+          <w:sz w:val="20"/>
+        </w:rPr>
+        <w:t>BAUD ?= 115200</w:t>
+      </w:r>
+      <w:r>
+        <w:rPr>
+          <w:sz w:val="20"/>
+        </w:rPr>
+        <w:t xml:space="preserve">, </w:t>
+      </w:r>
+      <w:r>
+        <w:rPr>
+          <w:rStyle w:val="VerbatimChar"/>
+          <w:sz w:val="20"/>
+        </w:rPr>
+        <w:t>VIVADO ?= vivado</w:t>
+      </w:r>
+      <w:r>
+        <w:rPr>
+          <w:sz w:val="20"/>
+        </w:rPr>
+        <w:t>.</w:t>
+      </w:r>
+    </w:p>
+    <w:p>
+      <w:pPr>
+        <w:pStyle w:val="TableCaption"/>
+        <w:rPr/>
+      </w:pPr>
+      <w:bookmarkStart w:id="55" w:name="_Tab_9_flows_ours_uart_make"/>
       <w:r>
         <w:rPr/>
         <w:t>flows-ours-uart make targets</w:t>
       </w:r>
-      <w:bookmarkEnd w:id="42"/>
+      <w:bookmarkEnd w:id="55"/>
     </w:p>
     <w:tbl>
       <w:tblPr>
@@ -8776,7 +10527,7 @@
         </w:rPr>
         <w:t>).</w:t>
       </w:r>
-      <w:bookmarkEnd w:id="41"/>
+      <w:bookmarkEnd w:id="54"/>
     </w:p>
     <w:p>
       <w:pPr>
@@ -8787,9 +10538,9 @@
         <w:spacing w:before="280" w:after="80"/>
         <w:rPr/>
       </w:pPr>
-      <w:bookmarkStart w:id="43" w:name="__RefHeading___Toc5148_3428382280"/>
-      <w:bookmarkStart w:id="44" w:name="the-host-programs-flows-ours-uarthost"/>
-      <w:bookmarkEnd w:id="43"/>
+      <w:bookmarkStart w:id="56" w:name="__RefHeading___Toc5492_4029633280"/>
+      <w:bookmarkStart w:id="57" w:name="the-host-programs-flows-ours-uarthost"/>
+      <w:bookmarkEnd w:id="56"/>
       <w:r>
         <w:rPr>
           <w:rStyle w:val="SectionNumber"/>
@@ -8797,7 +10548,7 @@
           <w:color w:val="228B22"/>
           <w:sz w:val="28"/>
         </w:rPr>
-        <w:t>4.2</w:t>
+        <w:t>5.2</w:t>
       </w:r>
       <w:r>
         <w:rPr>
@@ -9401,7 +11152,7 @@
         </w:rPr>
         <w:t>, the base-address constants, and the enum constants used throughout.</w:t>
       </w:r>
-      <w:bookmarkEnd w:id="44"/>
+      <w:bookmarkEnd w:id="57"/>
     </w:p>
     <w:p>
       <w:pPr>
@@ -9412,9 +11163,9 @@
         <w:spacing w:before="280" w:after="80"/>
         <w:rPr/>
       </w:pPr>
-      <w:bookmarkStart w:id="45" w:name="__RefHeading___Toc5150_3428382280"/>
-      <w:bookmarkStart w:id="46" w:name="typical-bring-up-sequence"/>
-      <w:bookmarkEnd w:id="45"/>
+      <w:bookmarkStart w:id="58" w:name="__RefHeading___Toc5494_4029633280"/>
+      <w:bookmarkStart w:id="59" w:name="typical-bring-up-sequence"/>
+      <w:bookmarkEnd w:id="58"/>
       <w:r>
         <w:rPr>
           <w:rStyle w:val="SectionNumber"/>
@@ -9422,7 +11173,7 @@
           <w:color w:val="228B22"/>
           <w:sz w:val="28"/>
         </w:rPr>
-        <w:t>4.3</w:t>
+        <w:t>5.3</w:t>
       </w:r>
       <w:r>
         <w:rPr>
@@ -9581,8 +11332,8 @@
         </w:rPr>
         <w:t xml:space="preserve"> sim</w:t>
       </w:r>
-      <w:bookmarkEnd w:id="39"/>
-      <w:bookmarkEnd w:id="46"/>
+      <w:bookmarkEnd w:id="52"/>
+      <w:bookmarkEnd w:id="59"/>
     </w:p>
     <w:p>
       <w:pPr>
@@ -9591,8 +11342,8 @@
         <w:spacing w:before="360" w:after="120"/>
         <w:rPr/>
       </w:pPr>
-      <w:bookmarkStart w:id="47" w:name="__RefHeading___Toc5152_3428382280"/>
-      <w:bookmarkEnd w:id="47"/>
+      <w:bookmarkStart w:id="60" w:name="__RefHeading___Toc5496_4029633280"/>
+      <w:bookmarkEnd w:id="60"/>
       <w:r>
         <w:rPr>
           <w:rStyle w:val="SectionNumber"/>
@@ -9600,7 +11351,7 @@
           <w:color w:val="FFFFFF"/>
           <w:sz w:val="32"/>
         </w:rPr>
-        <w:t>5</w:t>
+        <w:t>6</w:t>
       </w:r>
       <w:r>
         <w:rPr>
@@ -9621,8 +11372,8 @@
         <w:spacing w:before="280" w:after="80"/>
         <w:rPr/>
       </w:pPr>
-      <w:bookmarkStart w:id="48" w:name="__RefHeading___Toc5154_3428382280"/>
-      <w:bookmarkEnd w:id="48"/>
+      <w:bookmarkStart w:id="61" w:name="__RefHeading___Toc5498_4029633280"/>
+      <w:bookmarkEnd w:id="61"/>
       <w:r>
         <w:rPr>
           <w:rStyle w:val="SectionNumber"/>
@@ -9630,7 +11381,7 @@
           <w:color w:val="228B22"/>
           <w:sz w:val="28"/>
         </w:rPr>
-        <w:t>5.1</w:t>
+        <w:t>6.1</w:t>
       </w:r>
       <w:r>
         <w:rPr>
@@ -9698,12 +11449,12 @@
         <w:pStyle w:val="TableCaption"/>
         <w:rPr/>
       </w:pPr>
-      <w:bookmarkStart w:id="49" w:name="_Tab_8_Bridge_slave_address"/>
+      <w:bookmarkStart w:id="62" w:name="_Tab_10_Bridge_slave_address"/>
       <w:r>
         <w:rPr/>
         <w:t>Bridge slave address map</w:t>
       </w:r>
-      <w:bookmarkEnd w:id="49"/>
+      <w:bookmarkEnd w:id="62"/>
     </w:p>
     <w:tbl>
       <w:tblPr>
@@ -10541,8 +12292,8 @@
               </w:rPr>
               <w:t>AXIL — DFI cmd observability</w:t>
             </w:r>
-            <w:bookmarkStart w:id="50" w:name="bridge-address-map"/>
-            <w:bookmarkEnd w:id="50"/>
+            <w:bookmarkStart w:id="63" w:name="bridge-address-map"/>
+            <w:bookmarkEnd w:id="63"/>
           </w:p>
         </w:tc>
       </w:tr>
@@ -10556,8 +12307,8 @@
         <w:spacing w:before="280" w:after="80"/>
         <w:rPr/>
       </w:pPr>
-      <w:bookmarkStart w:id="51" w:name="__RefHeading___Toc5156_3428382280"/>
-      <w:bookmarkEnd w:id="51"/>
+      <w:bookmarkStart w:id="64" w:name="__RefHeading___Toc5500_4029633280"/>
+      <w:bookmarkEnd w:id="64"/>
       <w:r>
         <w:rPr>
           <w:rStyle w:val="SectionNumber"/>
@@ -10565,7 +12316,7 @@
           <w:color w:val="228B22"/>
           <w:sz w:val="28"/>
         </w:rPr>
-        <w:t>5.2</w:t>
+        <w:t>6.2</w:t>
       </w:r>
       <w:r>
         <w:rPr>
@@ -10779,10 +12530,10 @@
         <w:spacing w:before="200" w:after="80"/>
         <w:rPr/>
       </w:pPr>
-      <w:bookmarkStart w:id="52" w:name="__RefHeading___Toc5158_3428382280"/>
-      <w:bookmarkStart w:id="53" w:name="waveform-4.1-engine-kick-and-poll"/>
-      <w:bookmarkStart w:id="54" w:name="_Wave_4_1_Engine_Kick_and_Poll"/>
-      <w:bookmarkEnd w:id="52"/>
+      <w:bookmarkStart w:id="65" w:name="__RefHeading___Toc5502_4029633280"/>
+      <w:bookmarkStart w:id="66" w:name="waveform-5.1-engine-kick-and-poll"/>
+      <w:bookmarkStart w:id="67" w:name="_Wave_5_1_Engine_Kick_and_Poll"/>
+      <w:bookmarkEnd w:id="65"/>
       <w:r>
         <w:rPr>
           <w:rStyle w:val="SectionNumber"/>
@@ -10790,7 +12541,7 @@
           <w:color w:val="404040"/>
           <w:sz w:val="24"/>
         </w:rPr>
-        <w:t>5.2.1</w:t>
+        <w:t>6.2.1</w:t>
       </w:r>
       <w:r>
         <w:rPr>
@@ -10799,9 +12550,9 @@
           <w:sz w:val="24"/>
         </w:rPr>
         <w:tab/>
-        <w:t>Waveform 4.1: Engine Kick and Poll</w:t>
-      </w:r>
-      <w:bookmarkEnd w:id="54"/>
+        <w:t>Waveform 5.1: Engine Kick and Poll</w:t>
+      </w:r>
+      <w:bookmarkEnd w:id="67"/>
     </w:p>
     <w:p>
       <w:pPr>
@@ -10892,7 +12643,7 @@
           <w:t>01_engine_kick.json</w:t>
         </w:r>
       </w:hyperlink>
-      <w:bookmarkEnd w:id="53"/>
+      <w:bookmarkEnd w:id="66"/>
     </w:p>
     <w:p>
       <w:pPr>
@@ -10903,8 +12654,8 @@
         <w:spacing w:before="280" w:after="80"/>
         <w:rPr/>
       </w:pPr>
-      <w:bookmarkStart w:id="55" w:name="__RefHeading___Toc5160_3428382280"/>
-      <w:bookmarkEnd w:id="55"/>
+      <w:bookmarkStart w:id="68" w:name="__RefHeading___Toc5504_4029633280"/>
+      <w:bookmarkEnd w:id="68"/>
       <w:r>
         <w:rPr>
           <w:rStyle w:val="SectionNumber"/>
@@ -10912,7 +12663,7 @@
           <w:color w:val="228B22"/>
           <w:sz w:val="28"/>
         </w:rPr>
-        <w:t>5.3</w:t>
+        <w:t>6.3</w:t>
       </w:r>
       <w:r>
         <w:rPr>
@@ -10946,12 +12697,12 @@
         <w:pStyle w:val="TableCaption"/>
         <w:rPr/>
       </w:pPr>
-      <w:bookmarkStart w:id="56" w:name="_Tab_9_Control___status_reg"/>
+      <w:bookmarkStart w:id="69" w:name="_Tab_11_Control___status_reg"/>
       <w:r>
         <w:rPr/>
         <w:t>Control / status registers</w:t>
       </w:r>
-      <w:bookmarkEnd w:id="56"/>
+      <w:bookmarkEnd w:id="69"/>
     </w:p>
     <w:tbl>
       <w:tblPr>
@@ -14897,8 +16648,8 @@
               </w:rPr>
               <w:t>Beats mismatched</w:t>
             </w:r>
-            <w:bookmarkStart w:id="57" w:name="Xf4705603af6b434fe9ac36049a99cebf6d5eb83"/>
-            <w:bookmarkEnd w:id="57"/>
+            <w:bookmarkStart w:id="70" w:name="Xf4705603af6b434fe9ac36049a99cebf6d5eb83"/>
+            <w:bookmarkEnd w:id="70"/>
           </w:p>
         </w:tc>
       </w:tr>
@@ -14912,8 +16663,8 @@
         <w:spacing w:before="280" w:after="80"/>
         <w:rPr/>
       </w:pPr>
-      <w:bookmarkStart w:id="58" w:name="__RefHeading___Toc5162_3428382280"/>
-      <w:bookmarkEnd w:id="58"/>
+      <w:bookmarkStart w:id="71" w:name="__RefHeading___Toc5506_4029633280"/>
+      <w:bookmarkEnd w:id="71"/>
       <w:r>
         <w:rPr>
           <w:rStyle w:val="SectionNumber"/>
@@ -14921,7 +16672,7 @@
           <w:color w:val="228B22"/>
           <w:sz w:val="28"/>
         </w:rPr>
-        <w:t>5.4</w:t>
+        <w:t>6.4</w:t>
       </w:r>
       <w:r>
         <w:rPr>
@@ -14938,12 +16689,12 @@
         <w:pStyle w:val="TableCaption"/>
         <w:rPr/>
       </w:pPr>
-      <w:bookmarkStart w:id="59" w:name="_Tab_10_Characterization_tim"/>
+      <w:bookmarkStart w:id="72" w:name="_Tab_12_Characterization_tim"/>
       <w:r>
         <w:rPr/>
         <w:t>Characterization timer registers</w:t>
       </w:r>
-      <w:bookmarkEnd w:id="59"/>
+      <w:bookmarkEnd w:id="72"/>
     </w:p>
     <w:tbl>
       <w:tblPr>
@@ -15952,8 +17703,8 @@
         <w:spacing w:before="280" w:after="80"/>
         <w:rPr/>
       </w:pPr>
-      <w:bookmarkStart w:id="60" w:name="__RefHeading___Toc5164_3428382280"/>
-      <w:bookmarkEnd w:id="60"/>
+      <w:bookmarkStart w:id="73" w:name="__RefHeading___Toc5508_4029633280"/>
+      <w:bookmarkEnd w:id="73"/>
       <w:r>
         <w:rPr>
           <w:rStyle w:val="SectionNumber"/>
@@ -15961,7 +17712,7 @@
           <w:color w:val="228B22"/>
           <w:sz w:val="28"/>
         </w:rPr>
-        <w:t>5.5</w:t>
+        <w:t>6.5</w:t>
       </w:r>
       <w:r>
         <w:rPr>
@@ -15978,12 +17729,12 @@
         <w:pStyle w:val="TableCaption"/>
         <w:rPr/>
       </w:pPr>
-      <w:bookmarkStart w:id="61" w:name="_Tab_11_Runtime_controller_c"/>
+      <w:bookmarkStart w:id="74" w:name="_Tab_13_Runtime_controller_c"/>
       <w:r>
         <w:rPr/>
         <w:t>Runtime controller config and live DFI tuning</w:t>
       </w:r>
-      <w:bookmarkEnd w:id="61"/>
+      <w:bookmarkEnd w:id="74"/>
     </w:p>
     <w:tbl>
       <w:tblPr>
@@ -16602,7 +18353,7 @@
                 <w:szCs w:val="24"/>
                 <w:lang w:val="en-US" w:eastAsia="en-US" w:bidi="ar-SA"/>
               </w:rPr>
-              <w:t xml:space="preserve">PHY write latency (see Chapter 6 — board wants </w:t>
+              <w:t xml:space="preserve">PHY write latency (see Chapter 7 — board wants </w:t>
             </w:r>
             <w:r>
               <w:rPr>
@@ -17773,8 +19524,8 @@
         <w:spacing w:before="280" w:after="80"/>
         <w:rPr/>
       </w:pPr>
-      <w:bookmarkStart w:id="62" w:name="__RefHeading___Toc5166_3428382280"/>
-      <w:bookmarkEnd w:id="62"/>
+      <w:bookmarkStart w:id="75" w:name="__RefHeading___Toc5510_4029633280"/>
+      <w:bookmarkEnd w:id="75"/>
       <w:r>
         <w:rPr>
           <w:rStyle w:val="SectionNumber"/>
@@ -17782,7 +19533,7 @@
           <w:color w:val="228B22"/>
           <w:sz w:val="28"/>
         </w:rPr>
-        <w:t>5.6</w:t>
+        <w:t>6.6</w:t>
       </w:r>
       <w:r>
         <w:rPr>
@@ -17824,12 +19575,12 @@
         <w:pStyle w:val="TableCaption"/>
         <w:rPr/>
       </w:pPr>
-      <w:bookmarkStart w:id="63" w:name="_Tab_12_a7ddrphy_calibration"/>
+      <w:bookmarkStart w:id="76" w:name="_Tab_14_a7ddrphy_calibration"/>
       <w:r>
         <w:rPr/>
         <w:t>a7ddrphy calibration passthrough</w:t>
       </w:r>
-      <w:bookmarkEnd w:id="63"/>
+      <w:bookmarkEnd w:id="76"/>
     </w:p>
     <w:tbl>
       <w:tblPr>
@@ -18700,8 +20451,8 @@
         <w:spacing w:before="280" w:after="80"/>
         <w:rPr/>
       </w:pPr>
-      <w:bookmarkStart w:id="64" w:name="__RefHeading___Toc5168_3428382280"/>
-      <w:bookmarkEnd w:id="64"/>
+      <w:bookmarkStart w:id="77" w:name="__RefHeading___Toc5512_4029633280"/>
+      <w:bookmarkEnd w:id="77"/>
       <w:r>
         <w:rPr>
           <w:rStyle w:val="SectionNumber"/>
@@ -18709,7 +20460,7 @@
           <w:color w:val="228B22"/>
           <w:sz w:val="28"/>
         </w:rPr>
-        <w:t>5.7</w:t>
+        <w:t>6.7</w:t>
       </w:r>
       <w:r>
         <w:rPr>
@@ -18738,12 +20489,12 @@
         <w:pStyle w:val="TableCaption"/>
         <w:rPr/>
       </w:pPr>
-      <w:bookmarkStart w:id="65" w:name="_Tab_13_Write_engine_config_"/>
+      <w:bookmarkStart w:id="78" w:name="_Tab_15_Write_engine_config_"/>
       <w:r>
         <w:rPr/>
         <w:t>Write-engine config (read engine identical at +0x80)</w:t>
       </w:r>
-      <w:bookmarkEnd w:id="65"/>
+      <w:bookmarkEnd w:id="78"/>
     </w:p>
     <w:tbl>
       <w:tblPr>
@@ -21016,8 +22767,8 @@
         <w:spacing w:before="280" w:after="80"/>
         <w:rPr/>
       </w:pPr>
-      <w:bookmarkStart w:id="66" w:name="__RefHeading___Toc5170_3428382280"/>
-      <w:bookmarkEnd w:id="66"/>
+      <w:bookmarkStart w:id="79" w:name="__RefHeading___Toc5514_4029633280"/>
+      <w:bookmarkEnd w:id="79"/>
       <w:r>
         <w:rPr>
           <w:rStyle w:val="SectionNumber"/>
@@ -21025,7 +22776,7 @@
           <w:color w:val="228B22"/>
           <w:sz w:val="28"/>
         </w:rPr>
-        <w:t>5.8</w:t>
+        <w:t>6.8</w:t>
       </w:r>
       <w:r>
         <w:rPr>
@@ -21080,7 +22831,7 @@
         <w:pStyle w:val="TableCaption"/>
         <w:rPr/>
       </w:pPr>
-      <w:bookmarkStart w:id="67" w:name="_Tab_14_Perf_observability__"/>
+      <w:bookmarkStart w:id="80" w:name="_Tab_16_Perf_observability__"/>
       <w:r>
         <w:rPr/>
         <w:t xml:space="preserve">Perf observability (bin </w:t>
@@ -21096,7 +22847,7 @@
         <w:rPr/>
         <w:t xml:space="preserve"> covers [2^b, 2^(b+1)) cycles)</w:t>
       </w:r>
-      <w:bookmarkEnd w:id="67"/>
+      <w:bookmarkEnd w:id="80"/>
     </w:p>
     <w:tbl>
       <w:tblPr>
@@ -22408,8 +24159,8 @@
               </w:rPr>
               <w:t>Total txns on the selected metric</w:t>
             </w:r>
-            <w:bookmarkStart w:id="68" w:name="harness-csr-configuration"/>
-            <w:bookmarkEnd w:id="68"/>
+            <w:bookmarkStart w:id="81" w:name="harness-csr-configuration"/>
+            <w:bookmarkEnd w:id="81"/>
           </w:p>
         </w:tc>
       </w:tr>
@@ -22421,8 +24172,8 @@
         <w:spacing w:before="360" w:after="120"/>
         <w:rPr/>
       </w:pPr>
-      <w:bookmarkStart w:id="69" w:name="__RefHeading___Toc5172_3428382280"/>
-      <w:bookmarkEnd w:id="69"/>
+      <w:bookmarkStart w:id="82" w:name="__RefHeading___Toc5516_4029633280"/>
+      <w:bookmarkEnd w:id="82"/>
       <w:r>
         <w:rPr>
           <w:rStyle w:val="SectionNumber"/>
@@ -22430,7 +24181,7 @@
           <w:color w:val="FFFFFF"/>
           <w:sz w:val="32"/>
         </w:rPr>
-        <w:t>6</w:t>
+        <w:t>7</w:t>
       </w:r>
       <w:r>
         <w:rPr>
@@ -22542,9 +24293,9 @@
         <w:spacing w:before="280" w:after="80"/>
         <w:rPr/>
       </w:pPr>
-      <w:bookmarkStart w:id="70" w:name="__RefHeading___Toc5174_3428382280"/>
-      <w:bookmarkStart w:id="71" w:name="testbenches"/>
-      <w:bookmarkEnd w:id="70"/>
+      <w:bookmarkStart w:id="83" w:name="__RefHeading___Toc5518_4029633280"/>
+      <w:bookmarkStart w:id="84" w:name="testbenches"/>
+      <w:bookmarkEnd w:id="83"/>
       <w:r>
         <w:rPr>
           <w:rStyle w:val="SectionNumber"/>
@@ -22552,7 +24303,7 @@
           <w:color w:val="228B22"/>
           <w:sz w:val="28"/>
         </w:rPr>
-        <w:t>6.1</w:t>
+        <w:t>7.1</w:t>
       </w:r>
       <w:r>
         <w:rPr>
@@ -22569,12 +24320,12 @@
         <w:pStyle w:val="TableCaption"/>
         <w:rPr/>
       </w:pPr>
-      <w:bookmarkStart w:id="72" w:name="_Tab_15_Simulation_testbench"/>
+      <w:bookmarkStart w:id="85" w:name="_Tab_17_Simulation_testbench"/>
       <w:r>
         <w:rPr/>
         <w:t>Simulation testbenches</w:t>
       </w:r>
-      <w:bookmarkEnd w:id="72"/>
+      <w:bookmarkEnd w:id="85"/>
     </w:p>
     <w:tbl>
       <w:tblPr>
@@ -23058,7 +24809,7 @@
         </w:rPr>
         <w:t xml:space="preserve"> — it reproduces the digital DFI handshake, not the analog eye.</w:t>
       </w:r>
-      <w:bookmarkEnd w:id="71"/>
+      <w:bookmarkEnd w:id="84"/>
     </w:p>
     <w:p>
       <w:pPr>
@@ -23069,9 +24820,9 @@
         <w:spacing w:before="280" w:after="80"/>
         <w:rPr/>
       </w:pPr>
-      <w:bookmarkStart w:id="73" w:name="__RefHeading___Toc5176_3428382280"/>
-      <w:bookmarkStart w:id="74" w:name="how-the-same-program-runs-in-sim"/>
-      <w:bookmarkEnd w:id="73"/>
+      <w:bookmarkStart w:id="86" w:name="__RefHeading___Toc5520_4029633280"/>
+      <w:bookmarkStart w:id="87" w:name="how-the-same-program-runs-in-sim"/>
+      <w:bookmarkEnd w:id="86"/>
       <w:r>
         <w:rPr>
           <w:rStyle w:val="SectionNumber"/>
@@ -23079,7 +24830,7 @@
           <w:color w:val="228B22"/>
           <w:sz w:val="28"/>
         </w:rPr>
-        <w:t>6.2</w:t>
+        <w:t>7.2</w:t>
       </w:r>
       <w:r>
         <w:rPr>
@@ -23313,7 +25064,7 @@
         </w:rPr>
         <w:t xml:space="preserve"> run the same programs the board runs.</w:t>
       </w:r>
-      <w:bookmarkEnd w:id="74"/>
+      <w:bookmarkEnd w:id="87"/>
     </w:p>
     <w:p>
       <w:pPr>
@@ -23324,9 +25075,9 @@
         <w:spacing w:before="280" w:after="80"/>
         <w:rPr/>
       </w:pPr>
-      <w:bookmarkStart w:id="75" w:name="__RefHeading___Toc5178_3428382280"/>
-      <w:bookmarkStart w:id="76" w:name="match-the-boards-exact-dfi-config"/>
-      <w:bookmarkEnd w:id="75"/>
+      <w:bookmarkStart w:id="88" w:name="__RefHeading___Toc5522_4029633280"/>
+      <w:bookmarkStart w:id="89" w:name="match-the-boards-exact-dfi-config"/>
+      <w:bookmarkEnd w:id="88"/>
       <w:r>
         <w:rPr>
           <w:rStyle w:val="SectionNumber"/>
@@ -23334,7 +25085,7 @@
           <w:color w:val="228B22"/>
           <w:sz w:val="28"/>
         </w:rPr>
-        <w:t>6.3</w:t>
+        <w:t>7.3</w:t>
       </w:r>
       <w:r>
         <w:rPr>
@@ -23522,7 +25273,7 @@
         </w:rPr>
         <w:t>, …) exist to run the board’s real geometry.</w:t>
       </w:r>
-      <w:bookmarkEnd w:id="76"/>
+      <w:bookmarkEnd w:id="89"/>
     </w:p>
     <w:p>
       <w:pPr>
@@ -23533,9 +25284,9 @@
         <w:spacing w:before="280" w:after="80"/>
         <w:rPr/>
       </w:pPr>
-      <w:bookmarkStart w:id="77" w:name="__RefHeading___Toc5180_3428382280"/>
-      <w:bookmarkStart w:id="78" w:name="what-the-sim-can-and-cannot-reproduce"/>
-      <w:bookmarkEnd w:id="77"/>
+      <w:bookmarkStart w:id="90" w:name="__RefHeading___Toc5524_4029633280"/>
+      <w:bookmarkStart w:id="91" w:name="what-the-sim-can-and-cannot-reproduce"/>
+      <w:bookmarkEnd w:id="90"/>
       <w:r>
         <w:rPr>
           <w:rStyle w:val="SectionNumber"/>
@@ -23543,7 +25294,7 @@
           <w:color w:val="228B22"/>
           <w:sz w:val="28"/>
         </w:rPr>
-        <w:t>6.4</w:t>
+        <w:t>7.4</w:t>
       </w:r>
       <w:r>
         <w:rPr>
@@ -23560,7 +25311,7 @@
         <w:pStyle w:val="Compact"/>
         <w:numPr>
           <w:ilvl w:val="0"/>
-          <w:numId w:val="4"/>
+          <w:numId w:val="9"/>
         </w:numPr>
         <w:rPr/>
       </w:pPr>
@@ -23581,7 +25332,7 @@
         <w:pStyle w:val="Compact"/>
         <w:numPr>
           <w:ilvl w:val="0"/>
-          <w:numId w:val="5"/>
+          <w:numId w:val="10"/>
         </w:numPr>
         <w:rPr/>
       </w:pPr>
@@ -23596,7 +25347,7 @@
         <w:rPr/>
         <w:t xml:space="preserve"> analog PHY behavior. Xilinx SERDES/IDELAY in a7ddrphy do not simulate, so read-eye / DQS-gate / pin-LOC problems are silicon-only.</w:t>
       </w:r>
-      <w:bookmarkEnd w:id="78"/>
+      <w:bookmarkEnd w:id="91"/>
     </w:p>
     <w:p>
       <w:pPr>
@@ -23605,9 +25356,9 @@
         <w:spacing w:before="360" w:after="120"/>
         <w:rPr/>
       </w:pPr>
-      <w:bookmarkStart w:id="79" w:name="__RefHeading___Toc5182_3428382280"/>
-      <w:bookmarkStart w:id="80" w:name="troubleshooting"/>
-      <w:bookmarkEnd w:id="79"/>
+      <w:bookmarkStart w:id="92" w:name="__RefHeading___Toc5526_4029633280"/>
+      <w:bookmarkStart w:id="93" w:name="troubleshooting"/>
+      <w:bookmarkEnd w:id="92"/>
       <w:r>
         <w:rPr>
           <w:rStyle w:val="SectionNumber"/>
@@ -23615,7 +25366,7 @@
           <w:color w:val="FFFFFF"/>
           <w:sz w:val="32"/>
         </w:rPr>
-        <w:t>7</w:t>
+        <w:t>8</w:t>
       </w:r>
       <w:r>
         <w:rPr>
@@ -23636,9 +25387,9 @@
         <w:spacing w:before="280" w:after="80"/>
         <w:rPr/>
       </w:pPr>
-      <w:bookmarkStart w:id="81" w:name="__RefHeading___Toc5184_3428382280"/>
-      <w:bookmarkStart w:id="82" w:name="current-board-state"/>
-      <w:bookmarkEnd w:id="81"/>
+      <w:bookmarkStart w:id="94" w:name="__RefHeading___Toc5528_4029633280"/>
+      <w:bookmarkStart w:id="95" w:name="current-board-state"/>
+      <w:bookmarkEnd w:id="94"/>
       <w:r>
         <w:rPr>
           <w:rStyle w:val="SectionNumber"/>
@@ -23646,7 +25397,7 @@
           <w:color w:val="228B22"/>
           <w:sz w:val="28"/>
         </w:rPr>
-        <w:t>7.1</w:t>
+        <w:t>8.1</w:t>
       </w:r>
       <w:r>
         <w:rPr>
@@ -23828,14 +25579,14 @@
         <w:pStyle w:val="BodyText"/>
         <w:rPr/>
       </w:pPr>
-      <w:bookmarkStart w:id="83" w:name="current-board-state"/>
+      <w:bookmarkStart w:id="96" w:name="current-board-state"/>
       <w:r>
         <w:rPr>
           <w:sz w:val="20"/>
         </w:rPr>
         <w:t>After the runtime page-policy fix, OPEN vs CLOSE page policy moved read throughput from ~12.7 MB/s to ~112 MB/s (8.8×) and write to ~44 MB/s (3.5×). For reference, LiteDRAM on the same board reaches ~600 MB/s peak (300 MT/s memtest).</w:t>
       </w:r>
-      <w:bookmarkEnd w:id="83"/>
+      <w:bookmarkEnd w:id="96"/>
     </w:p>
     <w:p>
       <w:pPr>
@@ -23846,9 +25597,9 @@
         <w:spacing w:before="280" w:after="80"/>
         <w:rPr/>
       </w:pPr>
-      <w:bookmarkStart w:id="84" w:name="__RefHeading___Toc5186_3428382280"/>
-      <w:bookmarkStart w:id="85" w:name="sticky-errors-look-like-a-wedge"/>
-      <w:bookmarkEnd w:id="84"/>
+      <w:bookmarkStart w:id="97" w:name="__RefHeading___Toc5530_4029633280"/>
+      <w:bookmarkStart w:id="98" w:name="sticky-errors-look-like-a-wedge"/>
+      <w:bookmarkEnd w:id="97"/>
       <w:r>
         <w:rPr>
           <w:rStyle w:val="SectionNumber"/>
@@ -23856,7 +25607,7 @@
           <w:color w:val="228B22"/>
           <w:sz w:val="28"/>
         </w:rPr>
-        <w:t>7.2</w:t>
+        <w:t>8.2</w:t>
       </w:r>
       <w:r>
         <w:rPr>
@@ -23980,7 +25731,7 @@
         </w:rPr>
         <w:t xml:space="preserve"> engine (write-then-read is phased); a “wait for both” would hang.</w:t>
       </w:r>
-      <w:bookmarkEnd w:id="85"/>
+      <w:bookmarkEnd w:id="98"/>
     </w:p>
     <w:p>
       <w:pPr>
@@ -23991,8 +25742,8 @@
         <w:spacing w:before="280" w:after="80"/>
         <w:rPr/>
       </w:pPr>
-      <w:bookmarkStart w:id="86" w:name="__RefHeading___Toc5188_3428382280"/>
-      <w:bookmarkEnd w:id="86"/>
+      <w:bookmarkStart w:id="99" w:name="__RefHeading___Toc5532_4029633280"/>
+      <w:bookmarkEnd w:id="99"/>
       <w:r>
         <w:rPr>
           <w:rStyle w:val="SectionNumber"/>
@@ -24000,7 +25751,7 @@
           <w:color w:val="228B22"/>
           <w:sz w:val="28"/>
         </w:rPr>
-        <w:t>7.3</w:t>
+        <w:t>8.3</w:t>
       </w:r>
       <w:r>
         <w:rPr>
@@ -24017,12 +25768,12 @@
         <w:pStyle w:val="TableCaption"/>
         <w:rPr/>
       </w:pPr>
-      <w:bookmarkStart w:id="87" w:name="_Tab_16_Known_issues_and_bou"/>
+      <w:bookmarkStart w:id="100" w:name="_Tab_18_Known_issues_and_bou"/>
       <w:r>
         <w:rPr/>
         <w:t>Known issues and bounds</w:t>
       </w:r>
-      <w:bookmarkEnd w:id="87"/>
+      <w:bookmarkEnd w:id="100"/>
     </w:p>
     <w:tbl>
       <w:tblPr>
@@ -24604,8 +26355,8 @@
               </w:rPr>
               <w:t xml:space="preserve"> — advertise capability first</w:t>
             </w:r>
-            <w:bookmarkStart w:id="88" w:name="known-bugs-bounds"/>
-            <w:bookmarkEnd w:id="88"/>
+            <w:bookmarkStart w:id="101" w:name="known-bugs-bounds"/>
+            <w:bookmarkEnd w:id="101"/>
           </w:p>
         </w:tc>
       </w:tr>
@@ -24619,8 +26370,8 @@
         <w:spacing w:before="280" w:after="80"/>
         <w:rPr/>
       </w:pPr>
-      <w:bookmarkStart w:id="89" w:name="__RefHeading___Toc5190_3428382280"/>
-      <w:bookmarkEnd w:id="89"/>
+      <w:bookmarkStart w:id="102" w:name="__RefHeading___Toc5534_4029633280"/>
+      <w:bookmarkEnd w:id="102"/>
       <w:r>
         <w:rPr>
           <w:rStyle w:val="SectionNumber"/>
@@ -24628,7 +26379,7 @@
           <w:color w:val="228B22"/>
           <w:sz w:val="28"/>
         </w:rPr>
-        <w:t>7.4</w:t>
+        <w:t>8.4</w:t>
       </w:r>
       <w:r>
         <w:rPr>
@@ -24713,9 +26464,9 @@
         <w:spacing w:before="280" w:after="80"/>
         <w:rPr/>
       </w:pPr>
-      <w:bookmarkStart w:id="90" w:name="__RefHeading___Toc5192_3428382280"/>
-      <w:bookmarkStart w:id="91" w:name="a7ddrphy-is-not-simulatable"/>
-      <w:bookmarkEnd w:id="90"/>
+      <w:bookmarkStart w:id="103" w:name="__RefHeading___Toc5536_4029633280"/>
+      <w:bookmarkStart w:id="104" w:name="a7ddrphy-is-not-simulatable"/>
+      <w:bookmarkEnd w:id="103"/>
       <w:r>
         <w:rPr>
           <w:rStyle w:val="SectionNumber"/>
@@ -24723,7 +26474,7 @@
           <w:color w:val="228B22"/>
           <w:sz w:val="28"/>
         </w:rPr>
-        <w:t>7.5</w:t>
+        <w:t>8.5</w:t>
       </w:r>
       <w:r>
         <w:rPr>
@@ -24942,7 +26693,7 @@
         </w:rPr>
         <w:t># CSR offsets for firmware</w:t>
       </w:r>
-      <w:bookmarkEnd w:id="91"/>
+      <w:bookmarkEnd w:id="104"/>
     </w:p>
     <w:p>
       <w:pPr>
@@ -24953,9 +26704,9 @@
         <w:spacing w:before="280" w:after="80"/>
         <w:rPr/>
       </w:pPr>
-      <w:bookmarkStart w:id="92" w:name="__RefHeading___Toc5194_3428382280"/>
-      <w:bookmarkStart w:id="93" w:name="Xb4996f7623cf6e6f0c38e9b6a581c6231bef54b"/>
-      <w:bookmarkEnd w:id="92"/>
+      <w:bookmarkStart w:id="105" w:name="__RefHeading___Toc5538_4029633280"/>
+      <w:bookmarkStart w:id="106" w:name="Xb4996f7623cf6e6f0c38e9b6a581c6231bef54b"/>
+      <w:bookmarkEnd w:id="105"/>
       <w:r>
         <w:rPr>
           <w:rStyle w:val="SectionNumber"/>
@@ -24963,7 +26714,7 @@
           <w:color w:val="228B22"/>
           <w:sz w:val="28"/>
         </w:rPr>
-        <w:t>7.6</w:t>
+        <w:t>8.6</w:t>
       </w:r>
       <w:r>
         <w:rPr>
@@ -25034,7 +26785,7 @@
         </w:rPr>
         <w:t xml:space="preserve"> is unchanged (accesses &gt; 2 KB alias into the ring); the ring is effectively unused here. Raise it on a larger device.</w:t>
       </w:r>
-      <w:bookmarkEnd w:id="93"/>
+      <w:bookmarkEnd w:id="106"/>
     </w:p>
     <w:p>
       <w:pPr>
@@ -25045,9 +26796,9 @@
         <w:spacing w:before="280" w:after="80"/>
         <w:rPr/>
       </w:pPr>
-      <w:bookmarkStart w:id="94" w:name="__RefHeading___Toc5196_3428382280"/>
-      <w:bookmarkStart w:id="95" w:name="litedram-baseline-flow"/>
-      <w:bookmarkEnd w:id="94"/>
+      <w:bookmarkStart w:id="107" w:name="__RefHeading___Toc5540_4029633280"/>
+      <w:bookmarkStart w:id="108" w:name="litedram-baseline-flow"/>
+      <w:bookmarkEnd w:id="107"/>
       <w:r>
         <w:rPr>
           <w:rStyle w:val="SectionNumber"/>
@@ -25055,7 +26806,7 @@
           <w:color w:val="228B22"/>
           <w:sz w:val="28"/>
         </w:rPr>
-        <w:t>7.7</w:t>
+        <w:t>8.7</w:t>
       </w:r>
       <w:r>
         <w:rPr>
@@ -25138,8 +26889,8 @@
         </w:rPr>
         <w:t xml:space="preserve"> (needs riscv-gcc). The host variant (harness_csr at base 0, no pumice APB cfg) is still TODO.</w:t>
       </w:r>
-      <w:bookmarkEnd w:id="80"/>
-      <w:bookmarkEnd w:id="95"/>
+      <w:bookmarkEnd w:id="93"/>
+      <w:bookmarkEnd w:id="108"/>
     </w:p>
     <w:sectPr>
       <w:footerReference w:type="even" r:id="rId8"/>
@@ -25279,7 +27030,7 @@
           </w:r>
           <w:r>
             <w:rPr/>
-            <w:t>24</w:t>
+            <w:t>27</w:t>
           </w:r>
           <w:r>
             <w:rPr/>
@@ -25306,7 +27057,7 @@
           </w:r>
           <w:r>
             <w:rPr/>
-            <w:t>24</w:t>
+            <w:t>27</w:t>
           </w:r>
           <w:r>
             <w:rPr/>
@@ -25426,7 +27177,7 @@
           </w:r>
           <w:r>
             <w:rPr/>
-            <w:t>24</w:t>
+            <w:t>27</w:t>
           </w:r>
           <w:r>
             <w:rPr/>
@@ -25453,7 +27204,7 @@
           </w:r>
           <w:r>
             <w:rPr/>
-            <w:t>24</w:t>
+            <w:t>27</w:t>
           </w:r>
           <w:r>
             <w:rPr/>
@@ -25742,6 +27493,142 @@
   </w:abstractNum>
   <w:abstractNum w:abstractNumId="3">
     <w:lvl w:ilvl="0">
+      <w:numFmt w:val="bullet"/>
+      <w:lvlText w:val=""/>
+      <w:lvlJc w:val="left"/>
+      <w:pPr>
+        <w:tabs>
+          <w:tab w:val="num" w:pos="0"/>
+        </w:tabs>
+        <w:ind w:left="720" w:hanging="480"/>
+      </w:pPr>
+      <w:rPr>
+        <w:rFonts w:ascii="Symbol" w:hAnsi="Symbol" w:cs="Symbol" w:hint="default"/>
+      </w:rPr>
+    </w:lvl>
+    <w:lvl w:ilvl="1">
+      <w:start w:val="0"/>
+      <w:numFmt w:val="bullet"/>
+      <w:lvlText w:val=""/>
+      <w:lvlJc w:val="left"/>
+      <w:pPr>
+        <w:tabs>
+          <w:tab w:val="num" w:pos="0"/>
+        </w:tabs>
+        <w:ind w:left="1440" w:hanging="480"/>
+      </w:pPr>
+      <w:rPr>
+        <w:rFonts w:ascii="Symbol" w:hAnsi="Symbol" w:cs="Symbol" w:hint="default"/>
+      </w:rPr>
+    </w:lvl>
+    <w:lvl w:ilvl="2">
+      <w:start w:val="0"/>
+      <w:numFmt w:val="bullet"/>
+      <w:lvlText w:val=""/>
+      <w:lvlJc w:val="left"/>
+      <w:pPr>
+        <w:tabs>
+          <w:tab w:val="num" w:pos="0"/>
+        </w:tabs>
+        <w:ind w:left="2160" w:hanging="480"/>
+      </w:pPr>
+      <w:rPr>
+        <w:rFonts w:ascii="Symbol" w:hAnsi="Symbol" w:cs="Symbol" w:hint="default"/>
+      </w:rPr>
+    </w:lvl>
+    <w:lvl w:ilvl="3">
+      <w:start w:val="0"/>
+      <w:numFmt w:val="bullet"/>
+      <w:lvlText w:val=""/>
+      <w:lvlJc w:val="left"/>
+      <w:pPr>
+        <w:tabs>
+          <w:tab w:val="num" w:pos="0"/>
+        </w:tabs>
+        <w:ind w:left="2880" w:hanging="480"/>
+      </w:pPr>
+      <w:rPr>
+        <w:rFonts w:ascii="Symbol" w:hAnsi="Symbol" w:cs="Symbol" w:hint="default"/>
+      </w:rPr>
+    </w:lvl>
+    <w:lvl w:ilvl="4">
+      <w:start w:val="0"/>
+      <w:numFmt w:val="bullet"/>
+      <w:lvlText w:val=""/>
+      <w:lvlJc w:val="left"/>
+      <w:pPr>
+        <w:tabs>
+          <w:tab w:val="num" w:pos="0"/>
+        </w:tabs>
+        <w:ind w:left="3600" w:hanging="480"/>
+      </w:pPr>
+      <w:rPr>
+        <w:rFonts w:ascii="Symbol" w:hAnsi="Symbol" w:cs="Symbol" w:hint="default"/>
+      </w:rPr>
+    </w:lvl>
+    <w:lvl w:ilvl="5">
+      <w:start w:val="0"/>
+      <w:numFmt w:val="bullet"/>
+      <w:lvlText w:val=""/>
+      <w:lvlJc w:val="left"/>
+      <w:pPr>
+        <w:tabs>
+          <w:tab w:val="num" w:pos="0"/>
+        </w:tabs>
+        <w:ind w:left="4320" w:hanging="480"/>
+      </w:pPr>
+      <w:rPr>
+        <w:rFonts w:ascii="Symbol" w:hAnsi="Symbol" w:cs="Symbol" w:hint="default"/>
+      </w:rPr>
+    </w:lvl>
+    <w:lvl w:ilvl="6">
+      <w:start w:val="0"/>
+      <w:numFmt w:val="bullet"/>
+      <w:lvlText w:val=""/>
+      <w:lvlJc w:val="left"/>
+      <w:pPr>
+        <w:tabs>
+          <w:tab w:val="num" w:pos="0"/>
+        </w:tabs>
+        <w:ind w:left="5040" w:hanging="480"/>
+      </w:pPr>
+      <w:rPr>
+        <w:rFonts w:ascii="Symbol" w:hAnsi="Symbol" w:cs="Symbol" w:hint="default"/>
+      </w:rPr>
+    </w:lvl>
+    <w:lvl w:ilvl="7">
+      <w:start w:val="0"/>
+      <w:numFmt w:val="bullet"/>
+      <w:lvlText w:val=""/>
+      <w:lvlJc w:val="left"/>
+      <w:pPr>
+        <w:tabs>
+          <w:tab w:val="num" w:pos="0"/>
+        </w:tabs>
+        <w:ind w:left="5760" w:hanging="480"/>
+      </w:pPr>
+      <w:rPr>
+        <w:rFonts w:ascii="Symbol" w:hAnsi="Symbol" w:cs="Symbol" w:hint="default"/>
+      </w:rPr>
+    </w:lvl>
+    <w:lvl w:ilvl="8">
+      <w:start w:val="0"/>
+      <w:numFmt w:val="bullet"/>
+      <w:lvlText w:val=""/>
+      <w:lvlJc w:val="left"/>
+      <w:pPr>
+        <w:tabs>
+          <w:tab w:val="num" w:pos="0"/>
+        </w:tabs>
+        <w:ind w:left="6480" w:hanging="480"/>
+      </w:pPr>
+      <w:rPr>
+        <w:rFonts w:ascii="Symbol" w:hAnsi="Symbol" w:cs="Symbol" w:hint="default"/>
+      </w:rPr>
+    </w:lvl>
+  </w:abstractNum>
+  <w:abstractNum w:abstractNumId="4">
+    <w:lvl w:ilvl="0">
       <w:start w:val="1"/>
       <w:numFmt w:val="none"/>
       <w:suff w:val="nothing"/>
@@ -25869,9 +27756,24 @@
     <w:abstractNumId w:val="3"/>
   </w:num>
   <w:num w:numId="4">
+    <w:abstractNumId w:val="4"/>
+  </w:num>
+  <w:num w:numId="5">
     <w:abstractNumId w:val="1"/>
   </w:num>
-  <w:num w:numId="5">
+  <w:num w:numId="6">
+    <w:abstractNumId w:val="1"/>
+  </w:num>
+  <w:num w:numId="7">
+    <w:abstractNumId w:val="1"/>
+  </w:num>
+  <w:num w:numId="8">
+    <w:abstractNumId w:val="1"/>
+  </w:num>
+  <w:num w:numId="9">
+    <w:abstractNumId w:val="1"/>
+  </w:num>
+  <w:num w:numId="10">
     <w:abstractNumId w:val="1"/>
   </w:num>
 </w:numbering>

</xml_diff>